<commit_message>
Publish ADGL Release 2 research update
</commit_message>
<xml_diff>
--- a/research/paper/source-docx/ADGL_Appendix_A_Core_Semantic_Specification_0.3.0.docx
+++ b/research/paper/source-docx/ADGL_Appendix_A_Core_Semantic_Specification_0.3.0.docx
@@ -8,54 +8,100 @@
         <w:jc w:val="center"/>
       </w:pPr>
       <w:r>
+        <w:rPr>
+          <w:rFonts w:ascii="Tinos" w:hAnsi="Tinos" w:eastAsia="Tinos"/>
+          <w:b/>
+          <w:color w:val="000000"/>
+          <w:sz w:val="36"/>
+        </w:rPr>
         <w:t>ADGL Appendix A - Core Semantic Specification 0.3.0</w:t>
       </w:r>
     </w:p>
     <w:p>
       <w:pPr>
+        <w:pStyle w:val="AcademicAuthor"/>
         <w:jc w:val="center"/>
       </w:pPr>
       <w:r>
         <w:rPr>
+          <w:rFonts w:ascii="Tinos" w:hAnsi="Tinos" w:eastAsia="Tinos"/>
           <w:b/>
+          <w:color w:val="000000"/>
+          <w:sz w:val="22"/>
         </w:rPr>
         <w:t>GBSN Research</w:t>
       </w:r>
     </w:p>
     <w:p>
       <w:pPr>
+        <w:pStyle w:val="AcademicAffiliation"/>
         <w:jc w:val="center"/>
       </w:pPr>
       <w:r>
-        <w:t>Lisbon, Portugal | Correspondence: www.gbsnresearch.com (use Contacts)</w:t>
+        <w:t>Lisbon, Portugal | Correspondence: publications@gbsnresearch.com</w:t>
       </w:r>
     </w:p>
     <w:p>
       <w:pPr>
+        <w:pStyle w:val="AcademicMetadata"/>
+      </w:pPr>
+      <w:r>
+        <w:rPr>
+          <w:rFonts w:ascii="Tinos" w:hAnsi="Tinos" w:eastAsia="Tinos"/>
+          <w:i/>
+          <w:color w:val="555555"/>
+          <w:sz w:val="19"/>
+        </w:rPr>
+        <w:t>Academic preprint edition | Public Research Release 0.4.3</w:t>
+      </w:r>
+    </w:p>
+    <w:p>
+      <w:pPr>
+        <w:spacing w:after="200"/>
         <w:jc w:val="center"/>
       </w:pPr>
       <w:r>
         <w:rPr>
+          <w:rFonts w:ascii="Tinos" w:hAnsi="Tinos" w:eastAsia="Tinos"/>
           <w:i/>
+          <w:color w:val="333333"/>
+          <w:sz w:val="20"/>
         </w:rPr>
-        <w:t>Normative working draft companion to ADGL Main Paper v0.9</w:t>
-      </w:r>
-    </w:p>
-    <w:p>
-      <w:r>
-        <w:br w:type="page"/>
+        <w:t>Normative working draft companion to ADGL Main Paper v1.2</w:t>
       </w:r>
     </w:p>
     <w:p>
       <w:pPr>
+        <w:spacing w:after="0" w:before="0"/>
+      </w:pPr>
+      <w:r/>
+    </w:p>
+    <w:p>
+      <w:pPr>
         <w:pStyle w:val="Heading1"/>
+        <w:pageBreakBefore w:val="0"/>
       </w:pPr>
       <w:r>
+        <w:rPr>
+          <w:rFonts w:ascii="Tinos" w:hAnsi="Tinos" w:eastAsia="Tinos"/>
+          <w:color w:val="000000"/>
+          <w:sz w:val="26"/>
+        </w:rPr>
         <w:t>A.1 STATUS AND NORMATIVE LANGUAGE</w:t>
       </w:r>
     </w:p>
     <w:p>
+      <w:pPr>
+        <w:widowControl/>
+        <w:spacing w:after="120" w:line="259" w:lineRule="auto"/>
+        <w:jc w:val="both"/>
+      </w:pPr>
       <w:r>
+        <w:rPr>
+          <w:rFonts w:ascii="Tinos" w:hAnsi="Tinos" w:eastAsia="Tinos"/>
+          <w:color w:val="000000"/>
+          <w:sz w:val="22"/>
+        </w:rPr>
         <w:t>This appendix is the normative semantic core of ADGL Working Draft 0.3.0. MUST, MUST NOT, SHOULD, SHOULD NOT, and MAY indicate requirement strength. The reference YAML serialization is illustrative; conformance attaches to observable semantics rather than programming language or serialization format.</w:t>
       </w:r>
     </w:p>
@@ -64,6 +110,11 @@
         <w:pStyle w:val="Heading1"/>
       </w:pPr>
       <w:r>
+        <w:rPr>
+          <w:rFonts w:ascii="Tinos" w:hAnsi="Tinos" w:eastAsia="Tinos"/>
+          <w:color w:val="000000"/>
+          <w:sz w:val="26"/>
+        </w:rPr>
         <w:t>A.2 CORE OBJECT MODEL</w:t>
       </w:r>
     </w:p>
@@ -72,24 +123,48 @@
         <w:tblStyle w:val="TableGrid"/>
         <w:tblW w:type="auto" w:w="0"/>
         <w:jc w:val="center"/>
+        <w:tblLayout w:type="autofit"/>
         <w:tblLook w:firstColumn="1" w:firstRow="1" w:lastColumn="0" w:lastRow="0" w:noHBand="0" w:noVBand="1" w:val="04A0"/>
+        <w:tblBorders>
+          <w:top w:val="single" w:sz="5" w:space="0" w:color="B7B7B7"/>
+          <w:left w:val="single" w:sz="5" w:space="0" w:color="B7B7B7"/>
+          <w:bottom w:val="single" w:sz="5" w:space="0" w:color="B7B7B7"/>
+          <w:right w:val="single" w:sz="5" w:space="0" w:color="B7B7B7"/>
+          <w:insideH w:val="single" w:sz="5" w:space="0" w:color="B7B7B7"/>
+          <w:insideV w:val="single" w:sz="5" w:space="0" w:color="B7B7B7"/>
+        </w:tblBorders>
       </w:tblPr>
       <w:tblGrid>
         <w:gridCol w:w="5170"/>
         <w:gridCol w:w="5170"/>
       </w:tblGrid>
       <w:tr>
+        <w:trPr>
+          <w:tblHeader w:val="true"/>
+        </w:trPr>
         <w:tc>
           <w:tcPr>
             <w:tcW w:type="dxa" w:w="5170"/>
-            <w:shd w:fill="EDEDED"/>
+            <w:shd w:fill="EEEEEE"/>
             <w:vAlign w:val="center"/>
+            <w:tcMar>
+              <w:top w:w="70" w:type="dxa"/>
+              <w:start w:w="90" w:type="dxa"/>
+              <w:bottom w:w="70" w:type="dxa"/>
+              <w:end w:w="90" w:type="dxa"/>
+            </w:tcMar>
           </w:tcPr>
           <w:p>
+            <w:pPr>
+              <w:spacing w:after="40" w:before="20" w:line="240" w:lineRule="auto"/>
+              <w:jc w:val="left"/>
+            </w:pPr>
             <w:r>
               <w:rPr>
+                <w:rFonts w:ascii="Tinos" w:hAnsi="Tinos" w:eastAsia="Tinos"/>
                 <w:b/>
-                <w:sz w:val="16"/>
+                <w:color w:val="000000"/>
+                <w:sz w:val="18"/>
               </w:rPr>
               <w:t>Object</w:t>
             </w:r>
@@ -98,14 +173,26 @@
         <w:tc>
           <w:tcPr>
             <w:tcW w:type="dxa" w:w="5170"/>
-            <w:shd w:fill="EDEDED"/>
+            <w:shd w:fill="EEEEEE"/>
             <w:vAlign w:val="center"/>
+            <w:tcMar>
+              <w:top w:w="70" w:type="dxa"/>
+              <w:start w:w="90" w:type="dxa"/>
+              <w:bottom w:w="70" w:type="dxa"/>
+              <w:end w:w="90" w:type="dxa"/>
+            </w:tcMar>
           </w:tcPr>
           <w:p>
+            <w:pPr>
+              <w:spacing w:after="40" w:before="20" w:line="240" w:lineRule="auto"/>
+              <w:jc w:val="left"/>
+            </w:pPr>
             <w:r>
               <w:rPr>
+                <w:rFonts w:ascii="Tinos" w:hAnsi="Tinos" w:eastAsia="Tinos"/>
                 <w:b/>
-                <w:sz w:val="16"/>
+                <w:color w:val="000000"/>
+                <w:sz w:val="18"/>
               </w:rPr>
               <w:t>Meaning</w:t>
             </w:r>
@@ -113,15 +200,28 @@
         </w:tc>
       </w:tr>
       <w:tr>
+        <w:trPr/>
         <w:tc>
           <w:tcPr>
             <w:tcW w:type="dxa" w:w="5170"/>
             <w:vAlign w:val="center"/>
+            <w:tcMar>
+              <w:top w:w="70" w:type="dxa"/>
+              <w:start w:w="90" w:type="dxa"/>
+              <w:bottom w:w="70" w:type="dxa"/>
+              <w:end w:w="90" w:type="dxa"/>
+            </w:tcMar>
           </w:tcPr>
           <w:p>
+            <w:pPr>
+              <w:spacing w:after="40" w:before="20" w:line="240" w:lineRule="auto"/>
+              <w:jc w:val="left"/>
+            </w:pPr>
             <w:r>
               <w:rPr>
-                <w:sz w:val="16"/>
+                <w:rFonts w:ascii="Tinos" w:hAnsi="Tinos" w:eastAsia="Tinos"/>
+                <w:color w:val="000000"/>
+                <w:sz w:val="18"/>
               </w:rPr>
               <w:t>Case</w:t>
             </w:r>
@@ -131,11 +231,23 @@
           <w:tcPr>
             <w:tcW w:type="dxa" w:w="5170"/>
             <w:vAlign w:val="center"/>
+            <w:tcMar>
+              <w:top w:w="70" w:type="dxa"/>
+              <w:start w:w="90" w:type="dxa"/>
+              <w:bottom w:w="70" w:type="dxa"/>
+              <w:end w:w="90" w:type="dxa"/>
+            </w:tcMar>
           </w:tcPr>
           <w:p>
+            <w:pPr>
+              <w:spacing w:after="40" w:before="20" w:line="240" w:lineRule="auto"/>
+              <w:jc w:val="left"/>
+            </w:pPr>
             <w:r>
               <w:rPr>
-                <w:sz w:val="16"/>
+                <w:rFonts w:ascii="Tinos" w:hAnsi="Tinos" w:eastAsia="Tinos"/>
+                <w:color w:val="000000"/>
+                <w:sz w:val="18"/>
               </w:rPr>
               <w:t>Execution context binding purpose, subject, actors, jurisdiction, time, classification, policies and other case attributes.</w:t>
             </w:r>
@@ -143,15 +255,28 @@
         </w:tc>
       </w:tr>
       <w:tr>
+        <w:trPr/>
         <w:tc>
           <w:tcPr>
             <w:tcW w:type="dxa" w:w="5170"/>
             <w:vAlign w:val="center"/>
+            <w:tcMar>
+              <w:top w:w="70" w:type="dxa"/>
+              <w:start w:w="90" w:type="dxa"/>
+              <w:bottom w:w="70" w:type="dxa"/>
+              <w:end w:w="90" w:type="dxa"/>
+            </w:tcMar>
           </w:tcPr>
           <w:p>
+            <w:pPr>
+              <w:spacing w:after="40" w:before="20" w:line="240" w:lineRule="auto"/>
+              <w:jc w:val="left"/>
+            </w:pPr>
             <w:r>
               <w:rPr>
-                <w:sz w:val="16"/>
+                <w:rFonts w:ascii="Tinos" w:hAnsi="Tinos" w:eastAsia="Tinos"/>
+                <w:color w:val="000000"/>
+                <w:sz w:val="18"/>
               </w:rPr>
               <w:t>Policy</w:t>
             </w:r>
@@ -161,11 +286,23 @@
           <w:tcPr>
             <w:tcW w:type="dxa" w:w="5170"/>
             <w:vAlign w:val="center"/>
+            <w:tcMar>
+              <w:top w:w="70" w:type="dxa"/>
+              <w:start w:w="90" w:type="dxa"/>
+              <w:bottom w:w="70" w:type="dxa"/>
+              <w:end w:w="90" w:type="dxa"/>
+            </w:tcMar>
           </w:tcPr>
           <w:p>
+            <w:pPr>
+              <w:spacing w:after="40" w:before="20" w:line="240" w:lineRule="auto"/>
+              <w:jc w:val="left"/>
+            </w:pPr>
             <w:r>
               <w:rPr>
-                <w:sz w:val="16"/>
+                <w:rFonts w:ascii="Tinos" w:hAnsi="Tinos" w:eastAsia="Tinos"/>
+                <w:color w:val="000000"/>
+                <w:sz w:val="18"/>
               </w:rPr>
               <w:t>Versioned machine-evaluable governance statement.</w:t>
             </w:r>
@@ -173,15 +310,28 @@
         </w:tc>
       </w:tr>
       <w:tr>
+        <w:trPr/>
         <w:tc>
           <w:tcPr>
             <w:tcW w:type="dxa" w:w="5170"/>
             <w:vAlign w:val="center"/>
+            <w:tcMar>
+              <w:top w:w="70" w:type="dxa"/>
+              <w:start w:w="90" w:type="dxa"/>
+              <w:bottom w:w="70" w:type="dxa"/>
+              <w:end w:w="90" w:type="dxa"/>
+            </w:tcMar>
           </w:tcPr>
           <w:p>
+            <w:pPr>
+              <w:spacing w:after="40" w:before="20" w:line="240" w:lineRule="auto"/>
+              <w:jc w:val="left"/>
+            </w:pPr>
             <w:r>
               <w:rPr>
-                <w:sz w:val="16"/>
+                <w:rFonts w:ascii="Tinos" w:hAnsi="Tinos" w:eastAsia="Tinos"/>
+                <w:color w:val="000000"/>
+                <w:sz w:val="18"/>
               </w:rPr>
               <w:t>Profile</w:t>
             </w:r>
@@ -191,11 +341,23 @@
           <w:tcPr>
             <w:tcW w:type="dxa" w:w="5170"/>
             <w:vAlign w:val="center"/>
+            <w:tcMar>
+              <w:top w:w="70" w:type="dxa"/>
+              <w:start w:w="90" w:type="dxa"/>
+              <w:bottom w:w="70" w:type="dxa"/>
+              <w:end w:w="90" w:type="dxa"/>
+            </w:tcMar>
           </w:tcPr>
           <w:p>
+            <w:pPr>
+              <w:spacing w:after="40" w:before="20" w:line="240" w:lineRule="auto"/>
+              <w:jc w:val="left"/>
+            </w:pPr>
             <w:r>
               <w:rPr>
-                <w:sz w:val="16"/>
+                <w:rFonts w:ascii="Tinos" w:hAnsi="Tinos" w:eastAsia="Tinos"/>
+                <w:color w:val="000000"/>
+                <w:sz w:val="18"/>
               </w:rPr>
               <w:t>Named, versioned collection of ADGL policies, semantic constraints, control mappings, conformance fixtures and optional guidance.</w:t>
             </w:r>
@@ -203,15 +365,28 @@
         </w:tc>
       </w:tr>
       <w:tr>
+        <w:trPr/>
         <w:tc>
           <w:tcPr>
             <w:tcW w:type="dxa" w:w="5170"/>
             <w:vAlign w:val="center"/>
+            <w:tcMar>
+              <w:top w:w="70" w:type="dxa"/>
+              <w:start w:w="90" w:type="dxa"/>
+              <w:bottom w:w="70" w:type="dxa"/>
+              <w:end w:w="90" w:type="dxa"/>
+            </w:tcMar>
           </w:tcPr>
           <w:p>
+            <w:pPr>
+              <w:spacing w:after="40" w:before="20" w:line="240" w:lineRule="auto"/>
+              <w:jc w:val="left"/>
+            </w:pPr>
             <w:r>
               <w:rPr>
-                <w:sz w:val="16"/>
+                <w:rFonts w:ascii="Tinos" w:hAnsi="Tinos" w:eastAsia="Tinos"/>
+                <w:color w:val="000000"/>
+                <w:sz w:val="18"/>
               </w:rPr>
               <w:t>KnowledgeObject</w:t>
             </w:r>
@@ -221,11 +396,23 @@
           <w:tcPr>
             <w:tcW w:type="dxa" w:w="5170"/>
             <w:vAlign w:val="center"/>
+            <w:tcMar>
+              <w:top w:w="70" w:type="dxa"/>
+              <w:start w:w="90" w:type="dxa"/>
+              <w:bottom w:w="70" w:type="dxa"/>
+              <w:end w:w="90" w:type="dxa"/>
+            </w:tcMar>
           </w:tcPr>
           <w:p>
+            <w:pPr>
+              <w:spacing w:after="40" w:before="20" w:line="240" w:lineRule="auto"/>
+              <w:jc w:val="left"/>
+            </w:pPr>
             <w:r>
               <w:rPr>
-                <w:sz w:val="16"/>
+                <w:rFonts w:ascii="Tinos" w:hAnsi="Tinos" w:eastAsia="Tinos"/>
+                <w:color w:val="000000"/>
+                <w:sz w:val="18"/>
               </w:rPr>
               <w:t>Governable unit of information, including documents, records, messages, passages, datasets, claims, outputs and derived knowledge.</w:t>
             </w:r>
@@ -233,15 +420,28 @@
         </w:tc>
       </w:tr>
       <w:tr>
+        <w:trPr/>
         <w:tc>
           <w:tcPr>
             <w:tcW w:type="dxa" w:w="5170"/>
             <w:vAlign w:val="center"/>
+            <w:tcMar>
+              <w:top w:w="70" w:type="dxa"/>
+              <w:start w:w="90" w:type="dxa"/>
+              <w:bottom w:w="70" w:type="dxa"/>
+              <w:end w:w="90" w:type="dxa"/>
+            </w:tcMar>
           </w:tcPr>
           <w:p>
+            <w:pPr>
+              <w:spacing w:after="40" w:before="20" w:line="240" w:lineRule="auto"/>
+              <w:jc w:val="left"/>
+            </w:pPr>
             <w:r>
               <w:rPr>
-                <w:sz w:val="16"/>
+                <w:rFonts w:ascii="Tinos" w:hAnsi="Tinos" w:eastAsia="Tinos"/>
+                <w:color w:val="000000"/>
+                <w:sz w:val="18"/>
               </w:rPr>
               <w:t>Source</w:t>
             </w:r>
@@ -251,11 +451,23 @@
           <w:tcPr>
             <w:tcW w:type="dxa" w:w="5170"/>
             <w:vAlign w:val="center"/>
+            <w:tcMar>
+              <w:top w:w="70" w:type="dxa"/>
+              <w:start w:w="90" w:type="dxa"/>
+              <w:bottom w:w="70" w:type="dxa"/>
+              <w:end w:w="90" w:type="dxa"/>
+            </w:tcMar>
           </w:tcPr>
           <w:p>
+            <w:pPr>
+              <w:spacing w:after="40" w:before="20" w:line="240" w:lineRule="auto"/>
+              <w:jc w:val="left"/>
+            </w:pPr>
             <w:r>
               <w:rPr>
-                <w:sz w:val="16"/>
+                <w:rFonts w:ascii="Tinos" w:hAnsi="Tinos" w:eastAsia="Tinos"/>
+                <w:color w:val="000000"/>
+                <w:sz w:val="18"/>
               </w:rPr>
               <w:t>Origin/provider of a KnowledgeObject.</w:t>
             </w:r>
@@ -263,15 +475,28 @@
         </w:tc>
       </w:tr>
       <w:tr>
+        <w:trPr/>
         <w:tc>
           <w:tcPr>
             <w:tcW w:type="dxa" w:w="5170"/>
             <w:vAlign w:val="center"/>
+            <w:tcMar>
+              <w:top w:w="70" w:type="dxa"/>
+              <w:start w:w="90" w:type="dxa"/>
+              <w:bottom w:w="70" w:type="dxa"/>
+              <w:end w:w="90" w:type="dxa"/>
+            </w:tcMar>
           </w:tcPr>
           <w:p>
+            <w:pPr>
+              <w:spacing w:after="40" w:before="20" w:line="240" w:lineRule="auto"/>
+              <w:jc w:val="left"/>
+            </w:pPr>
             <w:r>
               <w:rPr>
-                <w:sz w:val="16"/>
+                <w:rFonts w:ascii="Tinos" w:hAnsi="Tinos" w:eastAsia="Tinos"/>
+                <w:color w:val="000000"/>
+                <w:sz w:val="18"/>
               </w:rPr>
               <w:t>Claim</w:t>
             </w:r>
@@ -281,11 +506,23 @@
           <w:tcPr>
             <w:tcW w:type="dxa" w:w="5170"/>
             <w:vAlign w:val="center"/>
+            <w:tcMar>
+              <w:top w:w="70" w:type="dxa"/>
+              <w:start w:w="90" w:type="dxa"/>
+              <w:bottom w:w="70" w:type="dxa"/>
+              <w:end w:w="90" w:type="dxa"/>
+            </w:tcMar>
           </w:tcPr>
           <w:p>
+            <w:pPr>
+              <w:spacing w:after="40" w:before="20" w:line="240" w:lineRule="auto"/>
+              <w:jc w:val="left"/>
+            </w:pPr>
             <w:r>
               <w:rPr>
-                <w:sz w:val="16"/>
+                <w:rFonts w:ascii="Tinos" w:hAnsi="Tinos" w:eastAsia="Tinos"/>
+                <w:color w:val="000000"/>
+                <w:sz w:val="18"/>
               </w:rPr>
               <w:t>Proposition capable of being supported, contradicted, qualified or unresolved.</w:t>
             </w:r>
@@ -293,15 +530,28 @@
         </w:tc>
       </w:tr>
       <w:tr>
+        <w:trPr/>
         <w:tc>
           <w:tcPr>
             <w:tcW w:type="dxa" w:w="5170"/>
             <w:vAlign w:val="center"/>
+            <w:tcMar>
+              <w:top w:w="70" w:type="dxa"/>
+              <w:start w:w="90" w:type="dxa"/>
+              <w:bottom w:w="70" w:type="dxa"/>
+              <w:end w:w="90" w:type="dxa"/>
+            </w:tcMar>
           </w:tcPr>
           <w:p>
+            <w:pPr>
+              <w:spacing w:after="40" w:before="20" w:line="240" w:lineRule="auto"/>
+              <w:jc w:val="left"/>
+            </w:pPr>
             <w:r>
               <w:rPr>
-                <w:sz w:val="16"/>
+                <w:rFonts w:ascii="Tinos" w:hAnsi="Tinos" w:eastAsia="Tinos"/>
+                <w:color w:val="000000"/>
+                <w:sz w:val="18"/>
               </w:rPr>
               <w:t>Evidence</w:t>
             </w:r>
@@ -311,11 +561,23 @@
           <w:tcPr>
             <w:tcW w:type="dxa" w:w="5170"/>
             <w:vAlign w:val="center"/>
+            <w:tcMar>
+              <w:top w:w="70" w:type="dxa"/>
+              <w:start w:w="90" w:type="dxa"/>
+              <w:bottom w:w="70" w:type="dxa"/>
+              <w:end w:w="90" w:type="dxa"/>
+            </w:tcMar>
           </w:tcPr>
           <w:p>
+            <w:pPr>
+              <w:spacing w:after="40" w:before="20" w:line="240" w:lineRule="auto"/>
+              <w:jc w:val="left"/>
+            </w:pPr>
             <w:r>
               <w:rPr>
-                <w:sz w:val="16"/>
+                <w:rFonts w:ascii="Tinos" w:hAnsi="Tinos" w:eastAsia="Tinos"/>
+                <w:color w:val="000000"/>
+                <w:sz w:val="18"/>
               </w:rPr>
               <w:t>KnowledgeObject used with respect to a Claim.</w:t>
             </w:r>
@@ -323,15 +585,28 @@
         </w:tc>
       </w:tr>
       <w:tr>
+        <w:trPr/>
         <w:tc>
           <w:tcPr>
             <w:tcW w:type="dxa" w:w="5170"/>
             <w:vAlign w:val="center"/>
+            <w:tcMar>
+              <w:top w:w="70" w:type="dxa"/>
+              <w:start w:w="90" w:type="dxa"/>
+              <w:bottom w:w="70" w:type="dxa"/>
+              <w:end w:w="90" w:type="dxa"/>
+            </w:tcMar>
           </w:tcPr>
           <w:p>
+            <w:pPr>
+              <w:spacing w:after="40" w:before="20" w:line="240" w:lineRule="auto"/>
+              <w:jc w:val="left"/>
+            </w:pPr>
             <w:r>
               <w:rPr>
-                <w:sz w:val="16"/>
+                <w:rFonts w:ascii="Tinos" w:hAnsi="Tinos" w:eastAsia="Tinos"/>
+                <w:color w:val="000000"/>
+                <w:sz w:val="18"/>
               </w:rPr>
               <w:t>Analysis</w:t>
             </w:r>
@@ -341,11 +616,23 @@
           <w:tcPr>
             <w:tcW w:type="dxa" w:w="5170"/>
             <w:vAlign w:val="center"/>
+            <w:tcMar>
+              <w:top w:w="70" w:type="dxa"/>
+              <w:start w:w="90" w:type="dxa"/>
+              <w:bottom w:w="70" w:type="dxa"/>
+              <w:end w:w="90" w:type="dxa"/>
+            </w:tcMar>
           </w:tcPr>
           <w:p>
+            <w:pPr>
+              <w:spacing w:after="40" w:before="20" w:line="240" w:lineRule="auto"/>
+              <w:jc w:val="left"/>
+            </w:pPr>
             <w:r>
               <w:rPr>
-                <w:sz w:val="16"/>
+                <w:rFonts w:ascii="Tinos" w:hAnsi="Tinos" w:eastAsia="Tinos"/>
+                <w:color w:val="000000"/>
+                <w:sz w:val="18"/>
               </w:rPr>
               <w:t>Governed analytical computation over admissible knowledge.</w:t>
             </w:r>
@@ -353,15 +640,28 @@
         </w:tc>
       </w:tr>
       <w:tr>
+        <w:trPr/>
         <w:tc>
           <w:tcPr>
             <w:tcW w:type="dxa" w:w="5170"/>
             <w:vAlign w:val="center"/>
+            <w:tcMar>
+              <w:top w:w="70" w:type="dxa"/>
+              <w:start w:w="90" w:type="dxa"/>
+              <w:bottom w:w="70" w:type="dxa"/>
+              <w:end w:w="90" w:type="dxa"/>
+            </w:tcMar>
           </w:tcPr>
           <w:p>
+            <w:pPr>
+              <w:spacing w:after="40" w:before="20" w:line="240" w:lineRule="auto"/>
+              <w:jc w:val="left"/>
+            </w:pPr>
             <w:r>
               <w:rPr>
-                <w:sz w:val="16"/>
+                <w:rFonts w:ascii="Tinos" w:hAnsi="Tinos" w:eastAsia="Tinos"/>
+                <w:color w:val="000000"/>
+                <w:sz w:val="18"/>
               </w:rPr>
               <w:t>AnalyticalMethod</w:t>
             </w:r>
@@ -371,11 +671,23 @@
           <w:tcPr>
             <w:tcW w:type="dxa" w:w="5170"/>
             <w:vAlign w:val="center"/>
+            <w:tcMar>
+              <w:top w:w="70" w:type="dxa"/>
+              <w:start w:w="90" w:type="dxa"/>
+              <w:bottom w:w="70" w:type="dxa"/>
+              <w:end w:w="90" w:type="dxa"/>
+            </w:tcMar>
           </w:tcPr>
           <w:p>
+            <w:pPr>
+              <w:spacing w:after="40" w:before="20" w:line="240" w:lineRule="auto"/>
+              <w:jc w:val="left"/>
+            </w:pPr>
             <w:r>
               <w:rPr>
-                <w:sz w:val="16"/>
+                <w:rFonts w:ascii="Tinos" w:hAnsi="Tinos" w:eastAsia="Tinos"/>
+                <w:color w:val="000000"/>
+                <w:sz w:val="18"/>
               </w:rPr>
               <w:t>Named method or class of method used in Analysis.</w:t>
             </w:r>
@@ -383,15 +695,28 @@
         </w:tc>
       </w:tr>
       <w:tr>
+        <w:trPr/>
         <w:tc>
           <w:tcPr>
             <w:tcW w:type="dxa" w:w="5170"/>
             <w:vAlign w:val="center"/>
+            <w:tcMar>
+              <w:top w:w="70" w:type="dxa"/>
+              <w:start w:w="90" w:type="dxa"/>
+              <w:bottom w:w="70" w:type="dxa"/>
+              <w:end w:w="90" w:type="dxa"/>
+            </w:tcMar>
           </w:tcPr>
           <w:p>
+            <w:pPr>
+              <w:spacing w:after="40" w:before="20" w:line="240" w:lineRule="auto"/>
+              <w:jc w:val="left"/>
+            </w:pPr>
             <w:r>
               <w:rPr>
-                <w:sz w:val="16"/>
+                <w:rFonts w:ascii="Tinos" w:hAnsi="Tinos" w:eastAsia="Tinos"/>
+                <w:color w:val="000000"/>
+                <w:sz w:val="18"/>
               </w:rPr>
               <w:t>AnalysisResult</w:t>
             </w:r>
@@ -401,11 +726,23 @@
           <w:tcPr>
             <w:tcW w:type="dxa" w:w="5170"/>
             <w:vAlign w:val="center"/>
+            <w:tcMar>
+              <w:top w:w="70" w:type="dxa"/>
+              <w:start w:w="90" w:type="dxa"/>
+              <w:bottom w:w="70" w:type="dxa"/>
+              <w:end w:w="90" w:type="dxa"/>
+            </w:tcMar>
           </w:tcPr>
           <w:p>
+            <w:pPr>
+              <w:spacing w:after="40" w:before="20" w:line="240" w:lineRule="auto"/>
+              <w:jc w:val="left"/>
+            </w:pPr>
             <w:r>
               <w:rPr>
-                <w:sz w:val="16"/>
+                <w:rFonts w:ascii="Tinos" w:hAnsi="Tinos" w:eastAsia="Tinos"/>
+                <w:color w:val="000000"/>
+                <w:sz w:val="18"/>
               </w:rPr>
               <w:t>Governed result generated by Analysis.</w:t>
             </w:r>
@@ -413,15 +750,28 @@
         </w:tc>
       </w:tr>
       <w:tr>
+        <w:trPr/>
         <w:tc>
           <w:tcPr>
             <w:tcW w:type="dxa" w:w="5170"/>
             <w:vAlign w:val="center"/>
+            <w:tcMar>
+              <w:top w:w="70" w:type="dxa"/>
+              <w:start w:w="90" w:type="dxa"/>
+              <w:bottom w:w="70" w:type="dxa"/>
+              <w:end w:w="90" w:type="dxa"/>
+            </w:tcMar>
           </w:tcPr>
           <w:p>
+            <w:pPr>
+              <w:spacing w:after="40" w:before="20" w:line="240" w:lineRule="auto"/>
+              <w:jc w:val="left"/>
+            </w:pPr>
             <w:r>
               <w:rPr>
-                <w:sz w:val="16"/>
+                <w:rFonts w:ascii="Tinos" w:hAnsi="Tinos" w:eastAsia="Tinos"/>
+                <w:color w:val="000000"/>
+                <w:sz w:val="18"/>
               </w:rPr>
               <w:t>ValidationRule</w:t>
             </w:r>
@@ -431,11 +781,23 @@
           <w:tcPr>
             <w:tcW w:type="dxa" w:w="5170"/>
             <w:vAlign w:val="center"/>
+            <w:tcMar>
+              <w:top w:w="70" w:type="dxa"/>
+              <w:start w:w="90" w:type="dxa"/>
+              <w:bottom w:w="70" w:type="dxa"/>
+              <w:end w:w="90" w:type="dxa"/>
+            </w:tcMar>
           </w:tcPr>
           <w:p>
+            <w:pPr>
+              <w:spacing w:after="40" w:before="20" w:line="240" w:lineRule="auto"/>
+              <w:jc w:val="left"/>
+            </w:pPr>
             <w:r>
               <w:rPr>
-                <w:sz w:val="16"/>
+                <w:rFonts w:ascii="Tinos" w:hAnsi="Tinos" w:eastAsia="Tinos"/>
+                <w:color w:val="000000"/>
+                <w:sz w:val="18"/>
               </w:rPr>
               <w:t>Condition requiring validation before an AnalysisResult may proceed.</w:t>
             </w:r>
@@ -443,15 +805,28 @@
         </w:tc>
       </w:tr>
       <w:tr>
+        <w:trPr/>
         <w:tc>
           <w:tcPr>
             <w:tcW w:type="dxa" w:w="5170"/>
             <w:vAlign w:val="center"/>
+            <w:tcMar>
+              <w:top w:w="70" w:type="dxa"/>
+              <w:start w:w="90" w:type="dxa"/>
+              <w:bottom w:w="70" w:type="dxa"/>
+              <w:end w:w="90" w:type="dxa"/>
+            </w:tcMar>
           </w:tcPr>
           <w:p>
+            <w:pPr>
+              <w:spacing w:after="40" w:before="20" w:line="240" w:lineRule="auto"/>
+              <w:jc w:val="left"/>
+            </w:pPr>
             <w:r>
               <w:rPr>
-                <w:sz w:val="16"/>
+                <w:rFonts w:ascii="Tinos" w:hAnsi="Tinos" w:eastAsia="Tinos"/>
+                <w:color w:val="000000"/>
+                <w:sz w:val="18"/>
               </w:rPr>
               <w:t>DecisionRight</w:t>
             </w:r>
@@ -461,11 +836,23 @@
           <w:tcPr>
             <w:tcW w:type="dxa" w:w="5170"/>
             <w:vAlign w:val="center"/>
+            <w:tcMar>
+              <w:top w:w="70" w:type="dxa"/>
+              <w:start w:w="90" w:type="dxa"/>
+              <w:bottom w:w="70" w:type="dxa"/>
+              <w:end w:w="90" w:type="dxa"/>
+            </w:tcMar>
           </w:tcPr>
           <w:p>
+            <w:pPr>
+              <w:spacing w:after="40" w:before="20" w:line="240" w:lineRule="auto"/>
+              <w:jc w:val="left"/>
+            </w:pPr>
             <w:r>
               <w:rPr>
-                <w:sz w:val="16"/>
+                <w:rFonts w:ascii="Tinos" w:hAnsi="Tinos" w:eastAsia="Tinos"/>
+                <w:color w:val="000000"/>
+                <w:sz w:val="18"/>
               </w:rPr>
               <w:t>Assignment of authority over a consequential next step.</w:t>
             </w:r>
@@ -473,15 +860,28 @@
         </w:tc>
       </w:tr>
       <w:tr>
+        <w:trPr/>
         <w:tc>
           <w:tcPr>
             <w:tcW w:type="dxa" w:w="5170"/>
             <w:vAlign w:val="center"/>
+            <w:tcMar>
+              <w:top w:w="70" w:type="dxa"/>
+              <w:start w:w="90" w:type="dxa"/>
+              <w:bottom w:w="70" w:type="dxa"/>
+              <w:end w:w="90" w:type="dxa"/>
+            </w:tcMar>
           </w:tcPr>
           <w:p>
+            <w:pPr>
+              <w:spacing w:after="40" w:before="20" w:line="240" w:lineRule="auto"/>
+              <w:jc w:val="left"/>
+            </w:pPr>
             <w:r>
               <w:rPr>
-                <w:sz w:val="16"/>
+                <w:rFonts w:ascii="Tinos" w:hAnsi="Tinos" w:eastAsia="Tinos"/>
+                <w:color w:val="000000"/>
+                <w:sz w:val="18"/>
               </w:rPr>
               <w:t>ReviewRequest</w:t>
             </w:r>
@@ -491,11 +891,23 @@
           <w:tcPr>
             <w:tcW w:type="dxa" w:w="5170"/>
             <w:vAlign w:val="center"/>
+            <w:tcMar>
+              <w:top w:w="70" w:type="dxa"/>
+              <w:start w:w="90" w:type="dxa"/>
+              <w:bottom w:w="70" w:type="dxa"/>
+              <w:end w:w="90" w:type="dxa"/>
+            </w:tcMar>
           </w:tcPr>
           <w:p>
+            <w:pPr>
+              <w:spacing w:after="40" w:before="20" w:line="240" w:lineRule="auto"/>
+              <w:jc w:val="left"/>
+            </w:pPr>
             <w:r>
               <w:rPr>
-                <w:sz w:val="16"/>
+                <w:rFonts w:ascii="Tinos" w:hAnsi="Tinos" w:eastAsia="Tinos"/>
+                <w:color w:val="000000"/>
+                <w:sz w:val="18"/>
               </w:rPr>
               <w:t>Request for human validation or decision.</w:t>
             </w:r>
@@ -503,15 +915,28 @@
         </w:tc>
       </w:tr>
       <w:tr>
+        <w:trPr/>
         <w:tc>
           <w:tcPr>
             <w:tcW w:type="dxa" w:w="5170"/>
             <w:vAlign w:val="center"/>
+            <w:tcMar>
+              <w:top w:w="70" w:type="dxa"/>
+              <w:start w:w="90" w:type="dxa"/>
+              <w:bottom w:w="70" w:type="dxa"/>
+              <w:end w:w="90" w:type="dxa"/>
+            </w:tcMar>
           </w:tcPr>
           <w:p>
+            <w:pPr>
+              <w:spacing w:after="40" w:before="20" w:line="240" w:lineRule="auto"/>
+              <w:jc w:val="left"/>
+            </w:pPr>
             <w:r>
               <w:rPr>
-                <w:sz w:val="16"/>
+                <w:rFonts w:ascii="Tinos" w:hAnsi="Tinos" w:eastAsia="Tinos"/>
+                <w:color w:val="000000"/>
+                <w:sz w:val="18"/>
               </w:rPr>
               <w:t>HumanDecision</w:t>
             </w:r>
@@ -521,11 +946,23 @@
           <w:tcPr>
             <w:tcW w:type="dxa" w:w="5170"/>
             <w:vAlign w:val="center"/>
+            <w:tcMar>
+              <w:top w:w="70" w:type="dxa"/>
+              <w:start w:w="90" w:type="dxa"/>
+              <w:bottom w:w="70" w:type="dxa"/>
+              <w:end w:w="90" w:type="dxa"/>
+            </w:tcMar>
           </w:tcPr>
           <w:p>
+            <w:pPr>
+              <w:spacing w:after="40" w:before="20" w:line="240" w:lineRule="auto"/>
+              <w:jc w:val="left"/>
+            </w:pPr>
             <w:r>
               <w:rPr>
-                <w:sz w:val="16"/>
+                <w:rFonts w:ascii="Tinos" w:hAnsi="Tinos" w:eastAsia="Tinos"/>
+                <w:color w:val="000000"/>
+                <w:sz w:val="18"/>
               </w:rPr>
               <w:t>Recorded human choice such as APPROVE, DENY, MODIFY, CONSENT, REQUEST_EVIDENCE, DEFER, or ESCALATE.</w:t>
             </w:r>
@@ -533,15 +970,28 @@
         </w:tc>
       </w:tr>
       <w:tr>
+        <w:trPr/>
         <w:tc>
           <w:tcPr>
             <w:tcW w:type="dxa" w:w="5170"/>
             <w:vAlign w:val="center"/>
+            <w:tcMar>
+              <w:top w:w="70" w:type="dxa"/>
+              <w:start w:w="90" w:type="dxa"/>
+              <w:bottom w:w="70" w:type="dxa"/>
+              <w:end w:w="90" w:type="dxa"/>
+            </w:tcMar>
           </w:tcPr>
           <w:p>
+            <w:pPr>
+              <w:spacing w:after="40" w:before="20" w:line="240" w:lineRule="auto"/>
+              <w:jc w:val="left"/>
+            </w:pPr>
             <w:r>
               <w:rPr>
-                <w:sz w:val="16"/>
+                <w:rFonts w:ascii="Tinos" w:hAnsi="Tinos" w:eastAsia="Tinos"/>
+                <w:color w:val="000000"/>
+                <w:sz w:val="18"/>
               </w:rPr>
               <w:t>ActionProposal</w:t>
             </w:r>
@@ -551,11 +1001,23 @@
           <w:tcPr>
             <w:tcW w:type="dxa" w:w="5170"/>
             <w:vAlign w:val="center"/>
+            <w:tcMar>
+              <w:top w:w="70" w:type="dxa"/>
+              <w:start w:w="90" w:type="dxa"/>
+              <w:bottom w:w="70" w:type="dxa"/>
+              <w:end w:w="90" w:type="dxa"/>
+            </w:tcMar>
           </w:tcPr>
           <w:p>
+            <w:pPr>
+              <w:spacing w:after="40" w:before="20" w:line="240" w:lineRule="auto"/>
+              <w:jc w:val="left"/>
+            </w:pPr>
             <w:r>
               <w:rPr>
-                <w:sz w:val="16"/>
+                <w:rFonts w:ascii="Tinos" w:hAnsi="Tinos" w:eastAsia="Tinos"/>
+                <w:color w:val="000000"/>
+                <w:sz w:val="18"/>
               </w:rPr>
               <w:t>Proposed consequential machine action derived from a governed result.</w:t>
             </w:r>
@@ -563,15 +1025,28 @@
         </w:tc>
       </w:tr>
       <w:tr>
+        <w:trPr/>
         <w:tc>
           <w:tcPr>
             <w:tcW w:type="dxa" w:w="5170"/>
             <w:vAlign w:val="center"/>
+            <w:tcMar>
+              <w:top w:w="70" w:type="dxa"/>
+              <w:start w:w="90" w:type="dxa"/>
+              <w:bottom w:w="70" w:type="dxa"/>
+              <w:end w:w="90" w:type="dxa"/>
+            </w:tcMar>
           </w:tcPr>
           <w:p>
+            <w:pPr>
+              <w:spacing w:after="40" w:before="20" w:line="240" w:lineRule="auto"/>
+              <w:jc w:val="left"/>
+            </w:pPr>
             <w:r>
               <w:rPr>
-                <w:sz w:val="16"/>
+                <w:rFonts w:ascii="Tinos" w:hAnsi="Tinos" w:eastAsia="Tinos"/>
+                <w:color w:val="000000"/>
+                <w:sz w:val="18"/>
               </w:rPr>
               <w:t>Action</w:t>
             </w:r>
@@ -581,11 +1056,23 @@
           <w:tcPr>
             <w:tcW w:type="dxa" w:w="5170"/>
             <w:vAlign w:val="center"/>
+            <w:tcMar>
+              <w:top w:w="70" w:type="dxa"/>
+              <w:start w:w="90" w:type="dxa"/>
+              <w:bottom w:w="70" w:type="dxa"/>
+              <w:end w:w="90" w:type="dxa"/>
+            </w:tcMar>
           </w:tcPr>
           <w:p>
+            <w:pPr>
+              <w:spacing w:after="40" w:before="20" w:line="240" w:lineRule="auto"/>
+              <w:jc w:val="left"/>
+            </w:pPr>
             <w:r>
               <w:rPr>
-                <w:sz w:val="16"/>
+                <w:rFonts w:ascii="Tinos" w:hAnsi="Tinos" w:eastAsia="Tinos"/>
+                <w:color w:val="000000"/>
+                <w:sz w:val="18"/>
               </w:rPr>
               <w:t>External state-changing instruction or operation.</w:t>
             </w:r>
@@ -593,15 +1080,28 @@
         </w:tc>
       </w:tr>
       <w:tr>
+        <w:trPr/>
         <w:tc>
           <w:tcPr>
             <w:tcW w:type="dxa" w:w="5170"/>
             <w:vAlign w:val="center"/>
+            <w:tcMar>
+              <w:top w:w="70" w:type="dxa"/>
+              <w:start w:w="90" w:type="dxa"/>
+              <w:bottom w:w="70" w:type="dxa"/>
+              <w:end w:w="90" w:type="dxa"/>
+            </w:tcMar>
           </w:tcPr>
           <w:p>
+            <w:pPr>
+              <w:spacing w:after="40" w:before="20" w:line="240" w:lineRule="auto"/>
+              <w:jc w:val="left"/>
+            </w:pPr>
             <w:r>
               <w:rPr>
-                <w:sz w:val="16"/>
+                <w:rFonts w:ascii="Tinos" w:hAnsi="Tinos" w:eastAsia="Tinos"/>
+                <w:color w:val="000000"/>
+                <w:sz w:val="18"/>
               </w:rPr>
               <w:t>CapabilityGrant</w:t>
             </w:r>
@@ -611,11 +1111,23 @@
           <w:tcPr>
             <w:tcW w:type="dxa" w:w="5170"/>
             <w:vAlign w:val="center"/>
+            <w:tcMar>
+              <w:top w:w="70" w:type="dxa"/>
+              <w:start w:w="90" w:type="dxa"/>
+              <w:bottom w:w="70" w:type="dxa"/>
+              <w:end w:w="90" w:type="dxa"/>
+            </w:tcMar>
           </w:tcPr>
           <w:p>
+            <w:pPr>
+              <w:spacing w:after="40" w:before="20" w:line="240" w:lineRule="auto"/>
+              <w:jc w:val="left"/>
+            </w:pPr>
             <w:r>
               <w:rPr>
-                <w:sz w:val="16"/>
+                <w:rFonts w:ascii="Tinos" w:hAnsi="Tinos" w:eastAsia="Tinos"/>
+                <w:color w:val="000000"/>
+                <w:sz w:val="18"/>
               </w:rPr>
               <w:t>Task-scoped authorization for one or more actions.</w:t>
             </w:r>
@@ -623,15 +1135,28 @@
         </w:tc>
       </w:tr>
       <w:tr>
+        <w:trPr/>
         <w:tc>
           <w:tcPr>
             <w:tcW w:type="dxa" w:w="5170"/>
             <w:vAlign w:val="center"/>
+            <w:tcMar>
+              <w:top w:w="70" w:type="dxa"/>
+              <w:start w:w="90" w:type="dxa"/>
+              <w:bottom w:w="70" w:type="dxa"/>
+              <w:end w:w="90" w:type="dxa"/>
+            </w:tcMar>
           </w:tcPr>
           <w:p>
+            <w:pPr>
+              <w:spacing w:after="40" w:before="20" w:line="240" w:lineRule="auto"/>
+              <w:jc w:val="left"/>
+            </w:pPr>
             <w:r>
               <w:rPr>
-                <w:sz w:val="16"/>
+                <w:rFonts w:ascii="Tinos" w:hAnsi="Tinos" w:eastAsia="Tinos"/>
+                <w:color w:val="000000"/>
+                <w:sz w:val="18"/>
               </w:rPr>
               <w:t>ModelResource</w:t>
             </w:r>
@@ -641,11 +1166,23 @@
           <w:tcPr>
             <w:tcW w:type="dxa" w:w="5170"/>
             <w:vAlign w:val="center"/>
+            <w:tcMar>
+              <w:top w:w="70" w:type="dxa"/>
+              <w:start w:w="90" w:type="dxa"/>
+              <w:bottom w:w="70" w:type="dxa"/>
+              <w:end w:w="90" w:type="dxa"/>
+            </w:tcMar>
           </w:tcPr>
           <w:p>
+            <w:pPr>
+              <w:spacing w:after="40" w:before="20" w:line="240" w:lineRule="auto"/>
+              <w:jc w:val="left"/>
+            </w:pPr>
             <w:r>
               <w:rPr>
-                <w:sz w:val="16"/>
+                <w:rFonts w:ascii="Tinos" w:hAnsi="Tinos" w:eastAsia="Tinos"/>
+                <w:color w:val="000000"/>
+                <w:sz w:val="18"/>
               </w:rPr>
               <w:t>Reasoning/analytical model available to a Case.</w:t>
             </w:r>
@@ -653,15 +1190,28 @@
         </w:tc>
       </w:tr>
       <w:tr>
+        <w:trPr/>
         <w:tc>
           <w:tcPr>
             <w:tcW w:type="dxa" w:w="5170"/>
             <w:vAlign w:val="center"/>
+            <w:tcMar>
+              <w:top w:w="70" w:type="dxa"/>
+              <w:start w:w="90" w:type="dxa"/>
+              <w:bottom w:w="70" w:type="dxa"/>
+              <w:end w:w="90" w:type="dxa"/>
+            </w:tcMar>
           </w:tcPr>
           <w:p>
+            <w:pPr>
+              <w:spacing w:after="40" w:before="20" w:line="240" w:lineRule="auto"/>
+              <w:jc w:val="left"/>
+            </w:pPr>
             <w:r>
               <w:rPr>
-                <w:sz w:val="16"/>
+                <w:rFonts w:ascii="Tinos" w:hAnsi="Tinos" w:eastAsia="Tinos"/>
+                <w:color w:val="000000"/>
+                <w:sz w:val="18"/>
               </w:rPr>
               <w:t>ProcessingEnvironment</w:t>
             </w:r>
@@ -671,11 +1221,23 @@
           <w:tcPr>
             <w:tcW w:type="dxa" w:w="5170"/>
             <w:vAlign w:val="center"/>
+            <w:tcMar>
+              <w:top w:w="70" w:type="dxa"/>
+              <w:start w:w="90" w:type="dxa"/>
+              <w:bottom w:w="70" w:type="dxa"/>
+              <w:end w:w="90" w:type="dxa"/>
+            </w:tcMar>
           </w:tcPr>
           <w:p>
+            <w:pPr>
+              <w:spacing w:after="40" w:before="20" w:line="240" w:lineRule="auto"/>
+              <w:jc w:val="left"/>
+            </w:pPr>
             <w:r>
               <w:rPr>
-                <w:sz w:val="16"/>
+                <w:rFonts w:ascii="Tinos" w:hAnsi="Tinos" w:eastAsia="Tinos"/>
+                <w:color w:val="000000"/>
+                <w:sz w:val="18"/>
               </w:rPr>
               <w:t>Execution location and deployment attributes.</w:t>
             </w:r>
@@ -683,15 +1245,28 @@
         </w:tc>
       </w:tr>
       <w:tr>
+        <w:trPr/>
         <w:tc>
           <w:tcPr>
             <w:tcW w:type="dxa" w:w="5170"/>
             <w:vAlign w:val="center"/>
+            <w:tcMar>
+              <w:top w:w="70" w:type="dxa"/>
+              <w:start w:w="90" w:type="dxa"/>
+              <w:bottom w:w="70" w:type="dxa"/>
+              <w:end w:w="90" w:type="dxa"/>
+            </w:tcMar>
           </w:tcPr>
           <w:p>
+            <w:pPr>
+              <w:spacing w:after="40" w:before="20" w:line="240" w:lineRule="auto"/>
+              <w:jc w:val="left"/>
+            </w:pPr>
             <w:r>
               <w:rPr>
-                <w:sz w:val="16"/>
+                <w:rFonts w:ascii="Tinos" w:hAnsi="Tinos" w:eastAsia="Tinos"/>
+                <w:color w:val="000000"/>
+                <w:sz w:val="18"/>
               </w:rPr>
               <w:t>Connector</w:t>
             </w:r>
@@ -701,11 +1276,23 @@
           <w:tcPr>
             <w:tcW w:type="dxa" w:w="5170"/>
             <w:vAlign w:val="center"/>
+            <w:tcMar>
+              <w:top w:w="70" w:type="dxa"/>
+              <w:start w:w="90" w:type="dxa"/>
+              <w:bottom w:w="70" w:type="dxa"/>
+              <w:end w:w="90" w:type="dxa"/>
+            </w:tcMar>
           </w:tcPr>
           <w:p>
+            <w:pPr>
+              <w:spacing w:after="40" w:before="20" w:line="240" w:lineRule="auto"/>
+              <w:jc w:val="left"/>
+            </w:pPr>
             <w:r>
               <w:rPr>
-                <w:sz w:val="16"/>
+                <w:rFonts w:ascii="Tinos" w:hAnsi="Tinos" w:eastAsia="Tinos"/>
+                <w:color w:val="000000"/>
+                <w:sz w:val="18"/>
               </w:rPr>
               <w:t>Interface to knowledge, tools or external systems.</w:t>
             </w:r>
@@ -713,15 +1300,28 @@
         </w:tc>
       </w:tr>
       <w:tr>
+        <w:trPr/>
         <w:tc>
           <w:tcPr>
             <w:tcW w:type="dxa" w:w="5170"/>
             <w:vAlign w:val="center"/>
+            <w:tcMar>
+              <w:top w:w="70" w:type="dxa"/>
+              <w:start w:w="90" w:type="dxa"/>
+              <w:bottom w:w="70" w:type="dxa"/>
+              <w:end w:w="90" w:type="dxa"/>
+            </w:tcMar>
           </w:tcPr>
           <w:p>
+            <w:pPr>
+              <w:spacing w:after="40" w:before="20" w:line="240" w:lineRule="auto"/>
+              <w:jc w:val="left"/>
+            </w:pPr>
             <w:r>
               <w:rPr>
-                <w:sz w:val="16"/>
+                <w:rFonts w:ascii="Tinos" w:hAnsi="Tinos" w:eastAsia="Tinos"/>
+                <w:color w:val="000000"/>
+                <w:sz w:val="18"/>
               </w:rPr>
               <w:t>AuditRecord</w:t>
             </w:r>
@@ -731,11 +1331,23 @@
           <w:tcPr>
             <w:tcW w:type="dxa" w:w="5170"/>
             <w:vAlign w:val="center"/>
+            <w:tcMar>
+              <w:top w:w="70" w:type="dxa"/>
+              <w:start w:w="90" w:type="dxa"/>
+              <w:bottom w:w="70" w:type="dxa"/>
+              <w:end w:w="90" w:type="dxa"/>
+            </w:tcMar>
           </w:tcPr>
           <w:p>
+            <w:pPr>
+              <w:spacing w:after="40" w:before="20" w:line="240" w:lineRule="auto"/>
+              <w:jc w:val="left"/>
+            </w:pPr>
             <w:r>
               <w:rPr>
-                <w:sz w:val="16"/>
+                <w:rFonts w:ascii="Tinos" w:hAnsi="Tinos" w:eastAsia="Tinos"/>
+                <w:color w:val="000000"/>
+                <w:sz w:val="18"/>
               </w:rPr>
               <w:t>End-to-end governance trace.</w:t>
             </w:r>
@@ -743,15 +1355,28 @@
         </w:tc>
       </w:tr>
       <w:tr>
+        <w:trPr/>
         <w:tc>
           <w:tcPr>
             <w:tcW w:type="dxa" w:w="5170"/>
             <w:vAlign w:val="center"/>
+            <w:tcMar>
+              <w:top w:w="70" w:type="dxa"/>
+              <w:start w:w="90" w:type="dxa"/>
+              <w:bottom w:w="70" w:type="dxa"/>
+              <w:end w:w="90" w:type="dxa"/>
+            </w:tcMar>
           </w:tcPr>
           <w:p>
+            <w:pPr>
+              <w:spacing w:after="40" w:before="20" w:line="240" w:lineRule="auto"/>
+              <w:jc w:val="left"/>
+            </w:pPr>
             <w:r>
               <w:rPr>
-                <w:sz w:val="16"/>
+                <w:rFonts w:ascii="Tinos" w:hAnsi="Tinos" w:eastAsia="Tinos"/>
+                <w:color w:val="000000"/>
+                <w:sz w:val="18"/>
               </w:rPr>
               <w:t>Event</w:t>
             </w:r>
@@ -761,11 +1386,23 @@
           <w:tcPr>
             <w:tcW w:type="dxa" w:w="5170"/>
             <w:vAlign w:val="center"/>
+            <w:tcMar>
+              <w:top w:w="70" w:type="dxa"/>
+              <w:start w:w="90" w:type="dxa"/>
+              <w:bottom w:w="70" w:type="dxa"/>
+              <w:end w:w="90" w:type="dxa"/>
+            </w:tcMar>
           </w:tcPr>
           <w:p>
+            <w:pPr>
+              <w:spacing w:after="40" w:before="20" w:line="240" w:lineRule="auto"/>
+              <w:jc w:val="left"/>
+            </w:pPr>
             <w:r>
               <w:rPr>
-                <w:sz w:val="16"/>
+                <w:rFonts w:ascii="Tinos" w:hAnsi="Tinos" w:eastAsia="Tinos"/>
+                <w:color w:val="000000"/>
+                <w:sz w:val="18"/>
               </w:rPr>
               <w:t>Recorded governance state transition.</w:t>
             </w:r>
@@ -778,11 +1415,26 @@
         <w:pStyle w:val="Heading1"/>
       </w:pPr>
       <w:r>
+        <w:rPr>
+          <w:rFonts w:ascii="Tinos" w:hAnsi="Tinos" w:eastAsia="Tinos"/>
+          <w:color w:val="000000"/>
+          <w:sz w:val="26"/>
+        </w:rPr>
         <w:t>A.3 CORE ATTRIBUTES</w:t>
       </w:r>
     </w:p>
     <w:p>
+      <w:pPr>
+        <w:widowControl/>
+        <w:spacing w:after="120" w:line="259" w:lineRule="auto"/>
+        <w:jc w:val="both"/>
+      </w:pPr>
       <w:r>
+        <w:rPr>
+          <w:rFonts w:ascii="Tinos" w:hAnsi="Tinos" w:eastAsia="Tinos"/>
+          <w:color w:val="000000"/>
+          <w:sz w:val="22"/>
+        </w:rPr>
         <w:t>Portable attributes include id, type, source, actor, purpose, created/effective time, status, classification, jurisdiction, region, provenance status, authority, priority, applicability, evidence role, model eligibility, processing constraints, analysis method, confidence, outcome disposition, decision owner, executor, derivation, retention, and policy version. Profiles MAY define additional namespaced attributes.</w:t>
       </w:r>
     </w:p>
@@ -791,20 +1443,41 @@
         <w:pStyle w:val="Heading1"/>
       </w:pPr>
       <w:r>
+        <w:rPr>
+          <w:rFonts w:ascii="Tinos" w:hAnsi="Tinos" w:eastAsia="Tinos"/>
+          <w:color w:val="000000"/>
+          <w:sz w:val="26"/>
+        </w:rPr>
         <w:t>A.4 CORE RELATIONSHIPS</w:t>
       </w:r>
     </w:p>
     <w:p>
+      <w:pPr>
+        <w:widowControl/>
+        <w:spacing w:after="120" w:line="259" w:lineRule="auto"/>
+        <w:jc w:val="both"/>
+      </w:pPr>
       <w:r>
         <w:rPr>
-          <w:rFonts w:ascii="Liberation Mono" w:hAnsi="Liberation Mono"/>
-          <w:sz w:val="15"/>
+          <w:rFonts w:ascii="Tinos" w:hAnsi="Tinos" w:eastAsia="Tinos"/>
+          <w:color w:val="000000"/>
+          <w:sz w:val="22"/>
         </w:rPr>
         <w:t>SUPPORTS | CONTRADICTS | QUALIFIES | CORROBORATES | DERIVES_FROM | SUPERSEDES | GOVERNS | APPLIES_TO | DEPENDS_ON | OVERRIDES | RESTRICTS | REQUIRES | GENERATES | VALIDATES | TRIGGERS</w:t>
       </w:r>
     </w:p>
     <w:p>
+      <w:pPr>
+        <w:widowControl/>
+        <w:spacing w:after="120" w:line="259" w:lineRule="auto"/>
+        <w:jc w:val="both"/>
+      </w:pPr>
       <w:r>
+        <w:rPr>
+          <w:rFonts w:ascii="Tinos" w:hAnsi="Tinos" w:eastAsia="Tinos"/>
+          <w:color w:val="000000"/>
+          <w:sz w:val="22"/>
+        </w:rPr>
         <w:t>Implementations MUST preserve relationship direction and provenance. DERIVES_FROM MUST be sufficient to support restriction propagation where policy requires it. GENERATES links an Analysis to an AnalysisResult or an Action to an ActionResult. VALIDATES links a validator event or source to an AnalysisResult. TRIGGERS links a governed result or decision to a consequential action.</w:t>
       </w:r>
     </w:p>
@@ -813,11 +1486,26 @@
         <w:pStyle w:val="Heading1"/>
       </w:pPr>
       <w:r>
+        <w:rPr>
+          <w:rFonts w:ascii="Tinos" w:hAnsi="Tinos" w:eastAsia="Tinos"/>
+          <w:color w:val="000000"/>
+          <w:sz w:val="26"/>
+        </w:rPr>
         <w:t>A.5 POLICY AND CASE SEMANTICS</w:t>
       </w:r>
     </w:p>
     <w:p>
+      <w:pPr>
+        <w:widowControl/>
+        <w:spacing w:after="120" w:line="259" w:lineRule="auto"/>
+        <w:jc w:val="both"/>
+      </w:pPr>
       <w:r>
+        <w:rPr>
+          <w:rFonts w:ascii="Tinos" w:hAnsi="Tinos" w:eastAsia="Tinos"/>
+          <w:color w:val="000000"/>
+          <w:sz w:val="22"/>
+        </w:rPr>
         <w:t>A Case MUST identify an execution purpose and MAY carry subject, actor, jurisdiction, classification, time, organization, risk, processing-location, and other attributes. Policy applicability is evaluated against the active Case. A policy that is valid for one purpose or jurisdiction MUST NOT be assumed to apply to another.</w:t>
       </w:r>
     </w:p>
@@ -826,20 +1514,41 @@
         <w:pStyle w:val="Heading1"/>
       </w:pPr>
       <w:r>
+        <w:rPr>
+          <w:rFonts w:ascii="Tinos" w:hAnsi="Tinos" w:eastAsia="Tinos"/>
+          <w:color w:val="000000"/>
+          <w:sz w:val="26"/>
+        </w:rPr>
         <w:t>A.6 COMMON CONTROL STRUCTURES</w:t>
       </w:r>
     </w:p>
     <w:p>
+      <w:pPr>
+        <w:widowControl/>
+        <w:spacing w:after="120" w:line="259" w:lineRule="auto"/>
+        <w:jc w:val="both"/>
+      </w:pPr>
       <w:r>
         <w:rPr>
-          <w:rFonts w:ascii="Liberation Mono" w:hAnsi="Liberation Mono"/>
-          <w:sz w:val="15"/>
+          <w:rFonts w:ascii="Tinos" w:hAnsi="Tinos" w:eastAsia="Tinos"/>
+          <w:color w:val="000000"/>
+          <w:sz w:val="22"/>
         </w:rPr>
         <w:t>CASE | SELECT | IF | WHEN | THEN/DO | ELSE | FOR_EACH | UNTIL | STOP | FALLBACK | EXCEPTION</w:t>
       </w:r>
     </w:p>
     <w:p>
+      <w:pPr>
+        <w:widowControl/>
+        <w:spacing w:after="120" w:line="259" w:lineRule="auto"/>
+        <w:jc w:val="both"/>
+      </w:pPr>
       <w:r>
+        <w:rPr>
+          <w:rFonts w:ascii="Tinos" w:hAnsi="Tinos" w:eastAsia="Tinos"/>
+          <w:color w:val="000000"/>
+          <w:sz w:val="22"/>
+        </w:rPr>
         <w:t>Selectors MAY address source, repository, document, record, field, section, author/actor, claim, evidence role, date, classification, jurisdiction, region, model, processing environment, analysis result, consequence disposition, action, or namespaced profile attributes.</w:t>
       </w:r>
     </w:p>
@@ -848,11 +1557,26 @@
         <w:pStyle w:val="Heading1"/>
       </w:pPr>
       <w:r>
+        <w:rPr>
+          <w:rFonts w:ascii="Tinos" w:hAnsi="Tinos" w:eastAsia="Tinos"/>
+          <w:color w:val="000000"/>
+          <w:sz w:val="26"/>
+        </w:rPr>
         <w:t>A.7 POLICY COMPOSITION AND PRECEDENCE</w:t>
       </w:r>
     </w:p>
     <w:p>
+      <w:pPr>
+        <w:widowControl/>
+        <w:spacing w:after="120" w:line="259" w:lineRule="auto"/>
+        <w:jc w:val="both"/>
+      </w:pPr>
       <w:r>
+        <w:rPr>
+          <w:rFonts w:ascii="Tinos" w:hAnsi="Tinos" w:eastAsia="Tinos"/>
+          <w:color w:val="000000"/>
+          <w:sz w:val="22"/>
+        </w:rPr>
         <w:t>The base precedence order is: (1) legal/regulatory/sovereign constraints; (2) explicit prohibitions and mandatory security constraints; (3) classification and processing-location constraints; (4) lifecycle restrictions; (5) governing-authority rules; (6) mandatory evidence and human-review obligations; (7) case-specific policy; (8) organizational defaults; (9) priority preferences; (10) fallback. Higher-precedence restrictions MUST dominate lower-precedence preferences unless an explicitly authorized override mechanism is defined by a Profile.</w:t>
       </w:r>
     </w:p>
@@ -861,6 +1585,11 @@
         <w:pStyle w:val="Heading1"/>
       </w:pPr>
       <w:r>
+        <w:rPr>
+          <w:rFonts w:ascii="Tinos" w:hAnsi="Tinos" w:eastAsia="Tinos"/>
+          <w:color w:val="000000"/>
+          <w:sz w:val="26"/>
+        </w:rPr>
         <w:t>A.8 DECISION OPERATIONS, STATES, AND REASON CODES</w:t>
       </w:r>
     </w:p>
@@ -869,24 +1598,48 @@
         <w:tblStyle w:val="TableGrid"/>
         <w:tblW w:type="auto" w:w="0"/>
         <w:jc w:val="center"/>
+        <w:tblLayout w:type="autofit"/>
         <w:tblLook w:firstColumn="1" w:firstRow="1" w:lastColumn="0" w:lastRow="0" w:noHBand="0" w:noVBand="1" w:val="04A0"/>
+        <w:tblBorders>
+          <w:top w:val="single" w:sz="5" w:space="0" w:color="B7B7B7"/>
+          <w:left w:val="single" w:sz="5" w:space="0" w:color="B7B7B7"/>
+          <w:bottom w:val="single" w:sz="5" w:space="0" w:color="B7B7B7"/>
+          <w:right w:val="single" w:sz="5" w:space="0" w:color="B7B7B7"/>
+          <w:insideH w:val="single" w:sz="5" w:space="0" w:color="B7B7B7"/>
+          <w:insideV w:val="single" w:sz="5" w:space="0" w:color="B7B7B7"/>
+        </w:tblBorders>
       </w:tblPr>
       <w:tblGrid>
         <w:gridCol w:w="5170"/>
         <w:gridCol w:w="5170"/>
       </w:tblGrid>
       <w:tr>
+        <w:trPr>
+          <w:tblHeader w:val="true"/>
+        </w:trPr>
         <w:tc>
           <w:tcPr>
             <w:tcW w:type="dxa" w:w="5170"/>
-            <w:shd w:fill="EDEDED"/>
+            <w:shd w:fill="EEEEEE"/>
             <w:vAlign w:val="center"/>
+            <w:tcMar>
+              <w:top w:w="70" w:type="dxa"/>
+              <w:start w:w="90" w:type="dxa"/>
+              <w:bottom w:w="70" w:type="dxa"/>
+              <w:end w:w="90" w:type="dxa"/>
+            </w:tcMar>
           </w:tcPr>
           <w:p>
+            <w:pPr>
+              <w:spacing w:after="40" w:before="20" w:line="240" w:lineRule="auto"/>
+              <w:jc w:val="left"/>
+            </w:pPr>
             <w:r>
               <w:rPr>
+                <w:rFonts w:ascii="Tinos" w:hAnsi="Tinos" w:eastAsia="Tinos"/>
                 <w:b/>
-                <w:sz w:val="16"/>
+                <w:color w:val="000000"/>
+                <w:sz w:val="18"/>
               </w:rPr>
               <w:t>Operation</w:t>
             </w:r>
@@ -895,14 +1648,26 @@
         <w:tc>
           <w:tcPr>
             <w:tcW w:type="dxa" w:w="5170"/>
-            <w:shd w:fill="EDEDED"/>
+            <w:shd w:fill="EEEEEE"/>
             <w:vAlign w:val="center"/>
+            <w:tcMar>
+              <w:top w:w="70" w:type="dxa"/>
+              <w:start w:w="90" w:type="dxa"/>
+              <w:bottom w:w="70" w:type="dxa"/>
+              <w:end w:w="90" w:type="dxa"/>
+            </w:tcMar>
           </w:tcPr>
           <w:p>
+            <w:pPr>
+              <w:spacing w:after="40" w:before="20" w:line="240" w:lineRule="auto"/>
+              <w:jc w:val="left"/>
+            </w:pPr>
             <w:r>
               <w:rPr>
+                <w:rFonts w:ascii="Tinos" w:hAnsi="Tinos" w:eastAsia="Tinos"/>
                 <w:b/>
-                <w:sz w:val="16"/>
+                <w:color w:val="000000"/>
+                <w:sz w:val="18"/>
               </w:rPr>
               <w:t>Resulting state</w:t>
             </w:r>
@@ -910,15 +1675,28 @@
         </w:tc>
       </w:tr>
       <w:tr>
+        <w:trPr/>
         <w:tc>
           <w:tcPr>
             <w:tcW w:type="dxa" w:w="5170"/>
             <w:vAlign w:val="center"/>
+            <w:tcMar>
+              <w:top w:w="70" w:type="dxa"/>
+              <w:start w:w="90" w:type="dxa"/>
+              <w:bottom w:w="70" w:type="dxa"/>
+              <w:end w:w="90" w:type="dxa"/>
+            </w:tcMar>
           </w:tcPr>
           <w:p>
+            <w:pPr>
+              <w:spacing w:after="40" w:before="20" w:line="240" w:lineRule="auto"/>
+              <w:jc w:val="left"/>
+            </w:pPr>
             <w:r>
               <w:rPr>
-                <w:sz w:val="16"/>
+                <w:rFonts w:ascii="Tinos" w:hAnsi="Tinos" w:eastAsia="Tinos"/>
+                <w:color w:val="000000"/>
+                <w:sz w:val="18"/>
               </w:rPr>
               <w:t>PERMIT</w:t>
             </w:r>
@@ -928,11 +1706,23 @@
           <w:tcPr>
             <w:tcW w:type="dxa" w:w="5170"/>
             <w:vAlign w:val="center"/>
+            <w:tcMar>
+              <w:top w:w="70" w:type="dxa"/>
+              <w:start w:w="90" w:type="dxa"/>
+              <w:bottom w:w="70" w:type="dxa"/>
+              <w:end w:w="90" w:type="dxa"/>
+            </w:tcMar>
           </w:tcPr>
           <w:p>
+            <w:pPr>
+              <w:spacing w:after="40" w:before="20" w:line="240" w:lineRule="auto"/>
+              <w:jc w:val="left"/>
+            </w:pPr>
             <w:r>
               <w:rPr>
-                <w:sz w:val="16"/>
+                <w:rFonts w:ascii="Tinos" w:hAnsi="Tinos" w:eastAsia="Tinos"/>
+                <w:color w:val="000000"/>
+                <w:sz w:val="18"/>
               </w:rPr>
               <w:t>PERMITTED</w:t>
             </w:r>
@@ -940,15 +1730,28 @@
         </w:tc>
       </w:tr>
       <w:tr>
+        <w:trPr/>
         <w:tc>
           <w:tcPr>
             <w:tcW w:type="dxa" w:w="5170"/>
             <w:vAlign w:val="center"/>
+            <w:tcMar>
+              <w:top w:w="70" w:type="dxa"/>
+              <w:start w:w="90" w:type="dxa"/>
+              <w:bottom w:w="70" w:type="dxa"/>
+              <w:end w:w="90" w:type="dxa"/>
+            </w:tcMar>
           </w:tcPr>
           <w:p>
+            <w:pPr>
+              <w:spacing w:after="40" w:before="20" w:line="240" w:lineRule="auto"/>
+              <w:jc w:val="left"/>
+            </w:pPr>
             <w:r>
               <w:rPr>
-                <w:sz w:val="16"/>
+                <w:rFonts w:ascii="Tinos" w:hAnsi="Tinos" w:eastAsia="Tinos"/>
+                <w:color w:val="000000"/>
+                <w:sz w:val="18"/>
               </w:rPr>
               <w:t>QUALIFY</w:t>
             </w:r>
@@ -958,11 +1761,23 @@
           <w:tcPr>
             <w:tcW w:type="dxa" w:w="5170"/>
             <w:vAlign w:val="center"/>
+            <w:tcMar>
+              <w:top w:w="70" w:type="dxa"/>
+              <w:start w:w="90" w:type="dxa"/>
+              <w:bottom w:w="70" w:type="dxa"/>
+              <w:end w:w="90" w:type="dxa"/>
+            </w:tcMar>
           </w:tcPr>
           <w:p>
+            <w:pPr>
+              <w:spacing w:after="40" w:before="20" w:line="240" w:lineRule="auto"/>
+              <w:jc w:val="left"/>
+            </w:pPr>
             <w:r>
               <w:rPr>
-                <w:sz w:val="16"/>
+                <w:rFonts w:ascii="Tinos" w:hAnsi="Tinos" w:eastAsia="Tinos"/>
+                <w:color w:val="000000"/>
+                <w:sz w:val="18"/>
               </w:rPr>
               <w:t>QUALIFIED</w:t>
             </w:r>
@@ -970,15 +1785,28 @@
         </w:tc>
       </w:tr>
       <w:tr>
+        <w:trPr/>
         <w:tc>
           <w:tcPr>
             <w:tcW w:type="dxa" w:w="5170"/>
             <w:vAlign w:val="center"/>
+            <w:tcMar>
+              <w:top w:w="70" w:type="dxa"/>
+              <w:start w:w="90" w:type="dxa"/>
+              <w:bottom w:w="70" w:type="dxa"/>
+              <w:end w:w="90" w:type="dxa"/>
+            </w:tcMar>
           </w:tcPr>
           <w:p>
+            <w:pPr>
+              <w:spacing w:after="40" w:before="20" w:line="240" w:lineRule="auto"/>
+              <w:jc w:val="left"/>
+            </w:pPr>
             <w:r>
               <w:rPr>
-                <w:sz w:val="16"/>
+                <w:rFonts w:ascii="Tinos" w:hAnsi="Tinos" w:eastAsia="Tinos"/>
+                <w:color w:val="000000"/>
+                <w:sz w:val="18"/>
               </w:rPr>
               <w:t>BLOCK</w:t>
             </w:r>
@@ -988,11 +1816,23 @@
           <w:tcPr>
             <w:tcW w:type="dxa" w:w="5170"/>
             <w:vAlign w:val="center"/>
+            <w:tcMar>
+              <w:top w:w="70" w:type="dxa"/>
+              <w:start w:w="90" w:type="dxa"/>
+              <w:bottom w:w="70" w:type="dxa"/>
+              <w:end w:w="90" w:type="dxa"/>
+            </w:tcMar>
           </w:tcPr>
           <w:p>
+            <w:pPr>
+              <w:spacing w:after="40" w:before="20" w:line="240" w:lineRule="auto"/>
+              <w:jc w:val="left"/>
+            </w:pPr>
             <w:r>
               <w:rPr>
-                <w:sz w:val="16"/>
+                <w:rFonts w:ascii="Tinos" w:hAnsi="Tinos" w:eastAsia="Tinos"/>
+                <w:color w:val="000000"/>
+                <w:sz w:val="18"/>
               </w:rPr>
               <w:t>BLOCKED</w:t>
             </w:r>
@@ -1000,15 +1840,28 @@
         </w:tc>
       </w:tr>
       <w:tr>
+        <w:trPr/>
         <w:tc>
           <w:tcPr>
             <w:tcW w:type="dxa" w:w="5170"/>
             <w:vAlign w:val="center"/>
+            <w:tcMar>
+              <w:top w:w="70" w:type="dxa"/>
+              <w:start w:w="90" w:type="dxa"/>
+              <w:bottom w:w="70" w:type="dxa"/>
+              <w:end w:w="90" w:type="dxa"/>
+            </w:tcMar>
           </w:tcPr>
           <w:p>
+            <w:pPr>
+              <w:spacing w:after="40" w:before="20" w:line="240" w:lineRule="auto"/>
+              <w:jc w:val="left"/>
+            </w:pPr>
             <w:r>
               <w:rPr>
-                <w:sz w:val="16"/>
+                <w:rFonts w:ascii="Tinos" w:hAnsi="Tinos" w:eastAsia="Tinos"/>
+                <w:color w:val="000000"/>
+                <w:sz w:val="18"/>
               </w:rPr>
               <w:t>ABSTAIN</w:t>
             </w:r>
@@ -1018,11 +1871,23 @@
           <w:tcPr>
             <w:tcW w:type="dxa" w:w="5170"/>
             <w:vAlign w:val="center"/>
+            <w:tcMar>
+              <w:top w:w="70" w:type="dxa"/>
+              <w:start w:w="90" w:type="dxa"/>
+              <w:bottom w:w="70" w:type="dxa"/>
+              <w:end w:w="90" w:type="dxa"/>
+            </w:tcMar>
           </w:tcPr>
           <w:p>
+            <w:pPr>
+              <w:spacing w:after="40" w:before="20" w:line="240" w:lineRule="auto"/>
+              <w:jc w:val="left"/>
+            </w:pPr>
             <w:r>
               <w:rPr>
-                <w:sz w:val="16"/>
+                <w:rFonts w:ascii="Tinos" w:hAnsi="Tinos" w:eastAsia="Tinos"/>
+                <w:color w:val="000000"/>
+                <w:sz w:val="18"/>
               </w:rPr>
               <w:t>ABSTAINED</w:t>
             </w:r>
@@ -1030,15 +1895,28 @@
         </w:tc>
       </w:tr>
       <w:tr>
+        <w:trPr/>
         <w:tc>
           <w:tcPr>
             <w:tcW w:type="dxa" w:w="5170"/>
             <w:vAlign w:val="center"/>
+            <w:tcMar>
+              <w:top w:w="70" w:type="dxa"/>
+              <w:start w:w="90" w:type="dxa"/>
+              <w:bottom w:w="70" w:type="dxa"/>
+              <w:end w:w="90" w:type="dxa"/>
+            </w:tcMar>
           </w:tcPr>
           <w:p>
+            <w:pPr>
+              <w:spacing w:after="40" w:before="20" w:line="240" w:lineRule="auto"/>
+              <w:jc w:val="left"/>
+            </w:pPr>
             <w:r>
               <w:rPr>
-                <w:sz w:val="16"/>
+                <w:rFonts w:ascii="Tinos" w:hAnsi="Tinos" w:eastAsia="Tinos"/>
+                <w:color w:val="000000"/>
+                <w:sz w:val="18"/>
               </w:rPr>
               <w:t>ESCALATE</w:t>
             </w:r>
@@ -1048,11 +1926,23 @@
           <w:tcPr>
             <w:tcW w:type="dxa" w:w="5170"/>
             <w:vAlign w:val="center"/>
+            <w:tcMar>
+              <w:top w:w="70" w:type="dxa"/>
+              <w:start w:w="90" w:type="dxa"/>
+              <w:bottom w:w="70" w:type="dxa"/>
+              <w:end w:w="90" w:type="dxa"/>
+            </w:tcMar>
           </w:tcPr>
           <w:p>
+            <w:pPr>
+              <w:spacing w:after="40" w:before="20" w:line="240" w:lineRule="auto"/>
+              <w:jc w:val="left"/>
+            </w:pPr>
             <w:r>
               <w:rPr>
-                <w:sz w:val="16"/>
+                <w:rFonts w:ascii="Tinos" w:hAnsi="Tinos" w:eastAsia="Tinos"/>
+                <w:color w:val="000000"/>
+                <w:sz w:val="18"/>
               </w:rPr>
               <w:t>ESCALATED</w:t>
             </w:r>
@@ -1060,15 +1950,28 @@
         </w:tc>
       </w:tr>
       <w:tr>
+        <w:trPr/>
         <w:tc>
           <w:tcPr>
             <w:tcW w:type="dxa" w:w="5170"/>
             <w:vAlign w:val="center"/>
+            <w:tcMar>
+              <w:top w:w="70" w:type="dxa"/>
+              <w:start w:w="90" w:type="dxa"/>
+              <w:bottom w:w="70" w:type="dxa"/>
+              <w:end w:w="90" w:type="dxa"/>
+            </w:tcMar>
           </w:tcPr>
           <w:p>
+            <w:pPr>
+              <w:spacing w:after="40" w:before="20" w:line="240" w:lineRule="auto"/>
+              <w:jc w:val="left"/>
+            </w:pPr>
             <w:r>
               <w:rPr>
-                <w:sz w:val="16"/>
+                <w:rFonts w:ascii="Tinos" w:hAnsi="Tinos" w:eastAsia="Tinos"/>
+                <w:color w:val="000000"/>
+                <w:sz w:val="18"/>
               </w:rPr>
               <w:t>REQUIRE_REVIEW</w:t>
             </w:r>
@@ -1078,11 +1981,23 @@
           <w:tcPr>
             <w:tcW w:type="dxa" w:w="5170"/>
             <w:vAlign w:val="center"/>
+            <w:tcMar>
+              <w:top w:w="70" w:type="dxa"/>
+              <w:start w:w="90" w:type="dxa"/>
+              <w:bottom w:w="70" w:type="dxa"/>
+              <w:end w:w="90" w:type="dxa"/>
+            </w:tcMar>
           </w:tcPr>
           <w:p>
+            <w:pPr>
+              <w:spacing w:after="40" w:before="20" w:line="240" w:lineRule="auto"/>
+              <w:jc w:val="left"/>
+            </w:pPr>
             <w:r>
               <w:rPr>
-                <w:sz w:val="16"/>
+                <w:rFonts w:ascii="Tinos" w:hAnsi="Tinos" w:eastAsia="Tinos"/>
+                <w:color w:val="000000"/>
+                <w:sz w:val="18"/>
               </w:rPr>
               <w:t>AWAITING_REVIEW</w:t>
             </w:r>
@@ -1091,7 +2006,17 @@
       </w:tr>
     </w:tbl>
     <w:p>
+      <w:pPr>
+        <w:widowControl/>
+        <w:spacing w:after="120" w:line="259" w:lineRule="auto"/>
+        <w:jc w:val="both"/>
+      </w:pPr>
       <w:r>
+        <w:rPr>
+          <w:rFonts w:ascii="Tinos" w:hAnsi="Tinos" w:eastAsia="Tinos"/>
+          <w:color w:val="000000"/>
+          <w:sz w:val="22"/>
+        </w:rPr>
         <w:t>Failure/reason codes are distinct from terminal states. Reference codes include INSUFFICIENT_EVIDENCE, POLICY_CONFLICT, NO_COMPLIANT_ROUTE, MISSING_ATTRIBUTE, PROVENANCE_UNRESOLVED, ANALYSIS_METHOD_NOT_PERMITTED, ANALYSIS_VALIDATION_REQUIRED, ACTION_NOT_AUTHORIZED, and AUDIT_FAILURE.</w:t>
       </w:r>
     </w:p>
@@ -1100,11 +2025,26 @@
         <w:pStyle w:val="Heading1"/>
       </w:pPr>
       <w:r>
+        <w:rPr>
+          <w:rFonts w:ascii="Tinos" w:hAnsi="Tinos" w:eastAsia="Tinos"/>
+          <w:color w:val="000000"/>
+          <w:sz w:val="26"/>
+        </w:rPr>
         <w:t>A.9 AUDIT MINIMUMS</w:t>
       </w:r>
     </w:p>
     <w:p>
+      <w:pPr>
+        <w:widowControl/>
+        <w:spacing w:after="120" w:line="259" w:lineRule="auto"/>
+        <w:jc w:val="both"/>
+      </w:pPr>
       <w:r>
+        <w:rPr>
+          <w:rFonts w:ascii="Tinos" w:hAnsi="Tinos" w:eastAsia="Tinos"/>
+          <w:color w:val="000000"/>
+          <w:sz w:val="22"/>
+        </w:rPr>
         <w:t>An auditable execution SHOULD record Case identity, policy identifiers/versions, candidate and admitted knowledge, object dispositions and reasons, evidence roles, authority/applicability results, model/tool and processing environment, analysis method and validation, conflicts, result state, consequence disposition, human decisions, machine action authorization, derivation links, timestamps, and relevant resulting state. Implementations MAY redact sensitive values while preserving verifiable hashes or references.</w:t>
       </w:r>
     </w:p>
@@ -1113,11 +2053,26 @@
         <w:pStyle w:val="Heading1"/>
       </w:pPr>
       <w:r>
+        <w:rPr>
+          <w:rFonts w:ascii="Tinos" w:hAnsi="Tinos" w:eastAsia="Tinos"/>
+          <w:color w:val="000000"/>
+          <w:sz w:val="26"/>
+        </w:rPr>
         <w:t>A.10 PROFILE SEMANTICS</w:t>
       </w:r>
     </w:p>
     <w:p>
+      <w:pPr>
+        <w:widowControl/>
+        <w:spacing w:after="120" w:line="259" w:lineRule="auto"/>
+        <w:jc w:val="both"/>
+      </w:pPr>
       <w:r>
+        <w:rPr>
+          <w:rFonts w:ascii="Tinos" w:hAnsi="Tinos" w:eastAsia="Tinos"/>
+          <w:color w:val="000000"/>
+          <w:sz w:val="22"/>
+        </w:rPr>
         <w:t>A Profile MUST have an identifier and version. It MAY define required operations, additional attributes, mappings to external frameworks, conformance fixtures, implementation guidance, and extension namespaces. Regulatory mappings SHOULD be marked informative unless the profile is maintained under an appropriate legal/compliance assurance process. ADGL conformance does not by itself establish compliance with external law or standards.</w:t>
       </w:r>
     </w:p>
@@ -1126,11 +2081,26 @@
         <w:pStyle w:val="Heading1"/>
       </w:pPr>
       <w:r>
+        <w:rPr>
+          <w:rFonts w:ascii="Tinos" w:hAnsi="Tinos" w:eastAsia="Tinos"/>
+          <w:color w:val="000000"/>
+          <w:sz w:val="26"/>
+        </w:rPr>
         <w:t>A.11 EXTENSIONS</w:t>
       </w:r>
     </w:p>
     <w:p>
+      <w:pPr>
+        <w:widowControl/>
+        <w:spacing w:after="120" w:line="259" w:lineRule="auto"/>
+        <w:jc w:val="both"/>
+      </w:pPr>
       <w:r>
+        <w:rPr>
+          <w:rFonts w:ascii="Tinos" w:hAnsi="Tinos" w:eastAsia="Tinos"/>
+          <w:color w:val="000000"/>
+          <w:sz w:val="22"/>
+        </w:rPr>
         <w:t>Unknown non-namespaced normative operations MUST be rejected by a conforming parser. Extensions MUST be namespaced or otherwise unambiguously distinguished from core vocabulary. Extensions MUST document semantic meaning, stage ownership, conflict behavior, audit requirements, and conformance tests.</w:t>
       </w:r>
     </w:p>
@@ -1139,19 +2109,53 @@
         <w:pStyle w:val="Heading1"/>
       </w:pPr>
       <w:r>
+        <w:rPr>
+          <w:rFonts w:ascii="Tinos" w:hAnsi="Tinos" w:eastAsia="Tinos"/>
+          <w:color w:val="000000"/>
+          <w:sz w:val="26"/>
+        </w:rPr>
         <w:t>A.12 BASE CONFORMANCE REQUIREMENTS</w:t>
       </w:r>
     </w:p>
     <w:p>
+      <w:pPr>
+        <w:widowControl/>
+        <w:spacing w:after="120" w:line="259" w:lineRule="auto"/>
+        <w:jc w:val="both"/>
+      </w:pPr>
       <w:r>
+        <w:rPr>
+          <w:rFonts w:ascii="Tinos" w:hAnsi="Tinos" w:eastAsia="Tinos"/>
+          <w:color w:val="000000"/>
+          <w:sz w:val="22"/>
+        </w:rPr>
         <w:t>A Core conforming implementation MUST demonstrate exclusion safety, quarantine isolation, embargo enforcement, supersession, separation of priority from authority, applicability gating, model/region safety when those controls are implemented, mandatory-evidence behavior, conflict preservation, derived-restriction propagation, audit completeness, deterministic replay for deterministic rules, and deterministic policy composition for the implemented profile. Stage-specific conformance requirements are defined in Appendix B.</w:t>
+      </w:r>
+    </w:p>
+    <w:p>
+      <w:pPr>
+        <w:pStyle w:val="Heading1"/>
+      </w:pPr>
+      <w:r>
+        <w:t>A.13 STATUS OF POST-SPECIFICATION INTEGRITY FINDINGS</w:t>
+      </w:r>
+    </w:p>
+    <w:p>
+      <w:r>
+        <w:t>Specification 0.3.0 remains the normative working baseline. Toolkit 0.5.3 and the unpublished KEE commercial MVP exposed additional execution-integrity and trust-boundary requirements after the baseline was published. Candidate checks C26-C36 are informative for this release and MUST NOT be represented as already normative Core 0.3 conformance.</w:t>
+      </w:r>
+    </w:p>
+    <w:p>
+      <w:r>
+        <w:t>Candidate topics include upstream terminal propagation, minimum analytical-output contracts, explicit and non-bypassable ACT authorization, trusted-time expiry, quota semantics, concrete-action validation, finite numeric values, strict grant scope, explicit human decision resolution, and action-template constraints. Authenticated issuer/actor trust, ExecutionSnapshot, AnalysisPlan, and authorization-to-execution transaction semantics remain open specification work.</w:t>
       </w:r>
     </w:p>
     <w:sectPr>
       <w:footerReference w:type="default" r:id="rId9"/>
-      <w:pgSz w:w="12240" w:h="15840"/>
-      <w:pgMar w:top="893" w:right="950" w:bottom="893" w:left="950" w:header="720" w:footer="720" w:gutter="0"/>
-      <w:cols w:space="720"/>
+      <w:headerReference w:type="default" r:id="rId10"/>
+      <w:pgSz w:w="11906" w:h="16838"/>
+      <w:pgMar w:top="1276" w:right="1332" w:bottom="1219" w:left="1332" w:header="482" w:footer="510" w:gutter="0"/>
+      <w:cols w:num="1"/>
       <w:docGrid w:linePitch="360"/>
     </w:sectPr>
   </w:body>
@@ -1167,13 +2171,46 @@
     </w:pPr>
     <w:r>
       <w:rPr>
-        <w:rFonts w:ascii="Times New Roman" w:hAnsi="Times New Roman"/>
-        <w:sz w:val="16"/>
-      </w:rPr>
-      <w:t>ADGL Appendix A | Core Semantic Specification 0.3.0 | GBSN Research</w:t>
+        <w:rFonts w:ascii="Tinos" w:hAnsi="Tinos" w:eastAsia="Tinos"/>
+        <w:color w:val="666666"/>
+        <w:sz w:val="17"/>
+      </w:rPr>
+      <w:t xml:space="preserve">Core Semantic Specification 0.3.0 | Public Research Release 0.4.3 | </w:t>
+    </w:r>
+    <w:r>
+      <w:rPr>
+        <w:rFonts w:ascii="Tinos" w:hAnsi="Tinos" w:eastAsia="Tinos"/>
+        <w:color w:val="666666"/>
+        <w:sz w:val="17"/>
+      </w:rPr>
+      <w:fldChar w:fldCharType="begin"/>
+      <w:instrText xml:space="preserve"> PAGE </w:instrText>
+      <w:fldChar w:fldCharType="end"/>
     </w:r>
   </w:p>
 </w:ftr>
+</file>
+
+<file path=word/header1.xml><?xml version="1.0" encoding="utf-8"?>
+<w:hdr xmlns:m="http://schemas.openxmlformats.org/officeDocument/2006/math" xmlns:mc="http://schemas.openxmlformats.org/markup-compatibility/2006" xmlns:mo="http://schemas.microsoft.com/office/mac/office/2008/main" xmlns:mv="urn:schemas-microsoft-com:mac:vml" xmlns:o="urn:schemas-microsoft-com:office:office" xmlns:r="http://schemas.openxmlformats.org/officeDocument/2006/relationships" xmlns:v="urn:schemas-microsoft-com:vml" xmlns:w10="urn:schemas-microsoft-com:office:word" xmlns:w14="http://schemas.microsoft.com/office/word/2010/wordml" xmlns:w="http://schemas.openxmlformats.org/wordprocessingml/2006/main" xmlns:wne="http://schemas.microsoft.com/office/word/2006/wordml" xmlns:wp14="http://schemas.microsoft.com/office/word/2010/wordprocessingDrawing" xmlns:wp="http://schemas.openxmlformats.org/drawingml/2006/wordprocessingDrawing" xmlns:wpc="http://schemas.microsoft.com/office/word/2010/wordprocessingCanvas" xmlns:wpg="http://schemas.microsoft.com/office/word/2010/wordprocessingGroup" xmlns:wpi="http://schemas.microsoft.com/office/word/2010/wordprocessingInk" xmlns:wps="http://schemas.microsoft.com/office/word/2010/wordprocessingShape" mc:Ignorable="w14 wp14">
+  <w:p>
+    <w:pPr>
+      <w:pStyle w:val="Header"/>
+      <w:jc w:val="center"/>
+      <w:pBdr>
+        <w:bottom w:val="single" w:sz="3" w:space="4" w:color="D9D9D9"/>
+      </w:pBdr>
+    </w:pPr>
+    <w:r>
+      <w:rPr>
+        <w:rFonts w:ascii="Tinos" w:hAnsi="Tinos" w:eastAsia="Tinos"/>
+        <w:color w:val="666666"/>
+        <w:sz w:val="17"/>
+      </w:rPr>
+      <w:t>ADGL Appendix A | GBSN Research</w:t>
+    </w:r>
+  </w:p>
+</w:hdr>
 </file>
 
 <file path=word/numbering.xml><?xml version="1.0" encoding="utf-8"?>
@@ -1539,9 +2576,14 @@
     <w:name w:val="Normal"/>
     <w:qFormat/>
     <w:rsid w:val="00FC693F"/>
+    <w:pPr>
+      <w:widowControl/>
+      <w:spacing w:after="120" w:before="0" w:line="259" w:lineRule="auto"/>
+      <w:jc w:val="both"/>
+    </w:pPr>
     <w:rPr>
-      <w:rFonts w:ascii="Times New Roman" w:hAnsi="Times New Roman"/>
-      <w:sz w:val="19"/>
+      <w:rFonts w:ascii="Tinos" w:hAnsi="Tinos" w:eastAsia="Tinos"/>
+      <w:sz w:val="22"/>
     </w:rPr>
   </w:style>
   <w:style w:type="paragraph" w:styleId="Header">
@@ -1599,15 +2641,16 @@
     <w:pPr>
       <w:keepNext/>
       <w:keepLines/>
-      <w:spacing w:before="480" w:after="0"/>
+      <w:spacing w:before="280" w:after="120"/>
+      <w:jc w:val="left"/>
       <w:outlineLvl w:val="0"/>
     </w:pPr>
     <w:rPr>
-      <w:rFonts w:asciiTheme="majorHAnsi" w:eastAsiaTheme="majorEastAsia" w:hAnsiTheme="majorHAnsi" w:cstheme="majorBidi" w:ascii="Times New Roman" w:hAnsi="Times New Roman"/>
+      <w:rFonts w:asciiTheme="majorHAnsi" w:eastAsiaTheme="majorEastAsia" w:hAnsiTheme="majorHAnsi" w:cstheme="majorBidi" w:ascii="Tinos" w:hAnsi="Tinos" w:eastAsia="Tinos"/>
       <w:b/>
       <w:bCs/>
-      <w:color w:val="365F91" w:themeColor="accent1" w:themeShade="BF"/>
-      <w:sz w:val="22"/>
+      <w:color w:val="000000"/>
+      <w:sz w:val="26"/>
       <w:szCs w:val="28"/>
     </w:rPr>
   </w:style>
@@ -1623,15 +2666,16 @@
     <w:pPr>
       <w:keepNext/>
       <w:keepLines/>
-      <w:spacing w:before="200" w:after="0"/>
+      <w:spacing w:before="200" w:after="80"/>
+      <w:jc w:val="left"/>
       <w:outlineLvl w:val="1"/>
     </w:pPr>
     <w:rPr>
-      <w:rFonts w:asciiTheme="majorHAnsi" w:eastAsiaTheme="majorEastAsia" w:hAnsiTheme="majorHAnsi" w:cstheme="majorBidi" w:ascii="Times New Roman" w:hAnsi="Times New Roman"/>
+      <w:rFonts w:asciiTheme="majorHAnsi" w:eastAsiaTheme="majorEastAsia" w:hAnsiTheme="majorHAnsi" w:cstheme="majorBidi" w:ascii="Tinos" w:hAnsi="Tinos" w:eastAsia="Tinos"/>
       <w:b/>
       <w:bCs/>
-      <w:color w:val="4F81BD" w:themeColor="accent1"/>
-      <w:sz w:val="20"/>
+      <w:color w:val="000000"/>
+      <w:sz w:val="23"/>
       <w:szCs w:val="26"/>
     </w:rPr>
   </w:style>
@@ -1647,15 +2691,16 @@
     <w:pPr>
       <w:keepNext/>
       <w:keepLines/>
-      <w:spacing w:before="200" w:after="0"/>
+      <w:spacing w:before="160" w:after="60"/>
+      <w:jc w:val="left"/>
       <w:outlineLvl w:val="2"/>
     </w:pPr>
     <w:rPr>
-      <w:rFonts w:asciiTheme="majorHAnsi" w:eastAsiaTheme="majorEastAsia" w:hAnsiTheme="majorHAnsi" w:cstheme="majorBidi" w:ascii="Times New Roman" w:hAnsi="Times New Roman"/>
+      <w:rFonts w:asciiTheme="majorHAnsi" w:eastAsiaTheme="majorEastAsia" w:hAnsiTheme="majorHAnsi" w:cstheme="majorBidi" w:ascii="Tinos" w:hAnsi="Tinos" w:eastAsia="Tinos"/>
       <w:b/>
       <w:bCs/>
-      <w:color w:val="4F81BD" w:themeColor="accent1"/>
-      <w:sz w:val="19"/>
+      <w:color w:val="000000"/>
+      <w:sz w:val="22"/>
     </w:rPr>
   </w:style>
   <w:style w:type="paragraph" w:styleId="Heading4">
@@ -1886,16 +2931,18 @@
     <w:qFormat/>
     <w:rsid w:val="00FC693F"/>
     <w:pPr>
+      <w:keepNext/>
       <w:pBdr>
         <w:bottom w:val="single" w:sz="8" w:space="4" w:color="4F81BD" w:themeColor="accent1"/>
       </w:pBdr>
-      <w:spacing w:after="300" w:line="240" w:lineRule="auto"/>
+      <w:spacing w:after="200" w:line="240" w:lineRule="auto" w:before="0"/>
       <w:contextualSpacing/>
+      <w:jc w:val="center"/>
     </w:pPr>
     <w:rPr>
-      <w:rFonts w:asciiTheme="majorHAnsi" w:eastAsiaTheme="majorEastAsia" w:hAnsiTheme="majorHAnsi" w:cstheme="majorBidi" w:ascii="Times New Roman" w:hAnsi="Times New Roman"/>
+      <w:rFonts w:asciiTheme="majorHAnsi" w:eastAsiaTheme="majorEastAsia" w:hAnsiTheme="majorHAnsi" w:cstheme="majorBidi" w:ascii="Tinos" w:hAnsi="Tinos" w:eastAsia="Tinos"/>
       <w:b/>
-      <w:color w:val="17365D" w:themeColor="text2" w:themeShade="BF"/>
+      <w:color w:val="000000"/>
       <w:spacing w:val="5"/>
       <w:kern w:val="28"/>
       <w:sz w:val="36"/>
@@ -13227,6 +14274,96 @@
         <w:shd w:val="clear" w:color="auto" w:fill="FBCAA2" w:themeFill="accent6" w:themeFillTint="7F"/>
       </w:tcPr>
     </w:tblStylePr>
+  </w:style>
+  <w:style w:type="paragraph" w:customStyle="1" w:styleId="AcademicAuthor">
+    <w:name w:val="Academic Author"/>
+    <w:basedOn w:val="Normal"/>
+    <w:pPr>
+      <w:spacing w:after="40"/>
+      <w:jc w:val="center"/>
+    </w:pPr>
+    <w:rPr>
+      <w:rFonts w:ascii="Tinos" w:hAnsi="Tinos" w:eastAsia="Tinos"/>
+      <w:b w:val="0"/>
+      <w:sz w:val="22"/>
+    </w:rPr>
+  </w:style>
+  <w:style w:type="paragraph" w:customStyle="1" w:styleId="AcademicAffiliation">
+    <w:name w:val="Academic Affiliation"/>
+    <w:basedOn w:val="Normal"/>
+    <w:pPr>
+      <w:spacing w:after="60"/>
+      <w:jc w:val="center"/>
+    </w:pPr>
+    <w:rPr>
+      <w:rFonts w:ascii="Tinos" w:hAnsi="Tinos" w:eastAsia="Tinos"/>
+      <w:sz w:val="20"/>
+    </w:rPr>
+  </w:style>
+  <w:style w:type="paragraph" w:customStyle="1" w:styleId="AcademicMetadata">
+    <w:name w:val="Academic Metadata"/>
+    <w:basedOn w:val="Normal"/>
+    <w:pPr>
+      <w:spacing w:after="200"/>
+      <w:jc w:val="center"/>
+    </w:pPr>
+    <w:rPr>
+      <w:rFonts w:ascii="Tinos" w:hAnsi="Tinos" w:eastAsia="Tinos"/>
+      <w:i/>
+      <w:color w:val="505050"/>
+      <w:sz w:val="19"/>
+    </w:rPr>
+  </w:style>
+  <w:style w:type="paragraph" w:customStyle="1" w:styleId="AcademicAbstract">
+    <w:name w:val="Academic Abstract"/>
+    <w:basedOn w:val="Normal"/>
+    <w:pPr>
+      <w:spacing w:after="120" w:line="252" w:lineRule="auto"/>
+      <w:jc w:val="both"/>
+    </w:pPr>
+    <w:rPr>
+      <w:rFonts w:ascii="Tinos" w:hAnsi="Tinos" w:eastAsia="Tinos"/>
+      <w:sz w:val="21"/>
+    </w:rPr>
+  </w:style>
+  <w:style w:type="paragraph" w:customStyle="1" w:styleId="AcademicCaption">
+    <w:name w:val="Academic Caption"/>
+    <w:basedOn w:val="Normal"/>
+    <w:pPr>
+      <w:keepNext/>
+      <w:spacing w:before="80" w:after="160"/>
+      <w:jc w:val="center"/>
+    </w:pPr>
+    <w:rPr>
+      <w:rFonts w:ascii="Tinos" w:hAnsi="Tinos" w:eastAsia="Tinos"/>
+      <w:i/>
+      <w:sz w:val="19"/>
+    </w:rPr>
+  </w:style>
+  <w:style w:type="paragraph" w:customStyle="1" w:styleId="AcademicReference">
+    <w:name w:val="Academic Reference"/>
+    <w:basedOn w:val="Normal"/>
+    <w:pPr>
+      <w:spacing w:after="60" w:line="240" w:lineRule="auto"/>
+      <w:ind w:left="340" w:hanging="340"/>
+      <w:jc w:val="left"/>
+    </w:pPr>
+    <w:rPr>
+      <w:rFonts w:ascii="Tinos" w:hAnsi="Tinos" w:eastAsia="Tinos"/>
+      <w:sz w:val="19"/>
+    </w:rPr>
+  </w:style>
+  <w:style w:type="paragraph" w:customStyle="1" w:styleId="AcademicCode">
+    <w:name w:val="Academic Code"/>
+    <w:basedOn w:val="Normal"/>
+    <w:pPr>
+      <w:spacing w:before="80" w:after="140" w:line="240" w:lineRule="auto"/>
+      <w:ind w:left="283" w:right="283"/>
+    </w:pPr>
+    <w:rPr>
+      <w:rFonts w:ascii="Liberation Mono" w:hAnsi="Liberation Mono" w:eastAsia="Liberation Mono"/>
+      <w:sz w:val="17"/>
+    </w:rPr>
   </w:style>
 </w:styles>
 </file>

</xml_diff>